<commit_message>
Major update: expanded product line (23 SKUs), investor version, updated all financials
- Added Smart Water Controllers (4 tiers), Smart Home & Electrical, Learning Tablets,
  Energy Storage, Advertising/LED Displays, Self-Service Kiosks, POS Tablet PCs
- Budget rebalanced: Hardware ₦75M, People ₦70M, Tech ₦24M, Marketing ₦22M,
  Contingency ₦21M, Ops ₦16M, Logistics ₦12M, Legal ₦10M = ₦250M
- Lean headcount: 5→9→13→18→22-25 over 18 months
- Brand philosophy: reliability, quality, good price for your money
- Mission: technology and platform infrastructure enablers for people
- PSSP/PTSP detailed breakdown with escrow duration (life of license)
- Created investor-facing version (no tech stack/open-source details)
- Added product portfolio image (23 SKUs across 5 categories)
- Regenerated all charts, Word docs, and PDFs with updated numbers

https://claude.ai/code/session_014AKpynNrHyqLfWAM6MLBvL
</commit_message>
<xml_diff>
--- a/PECH_PROPOSAL_EXECUTIVE_SUMMARY.docx
+++ b/PECH_PROPOSAL_EXECUTIVE_SUMMARY.docx
@@ -2,6 +2,14 @@
 <file path=word/document.xml><?xml version="1.0" encoding="utf-8"?>
 <w:document xmlns:w="http://schemas.openxmlformats.org/wordprocessingml/2006/main" xmlns:m="http://schemas.openxmlformats.org/officeDocument/2006/math" xmlns:r="http://schemas.openxmlformats.org/officeDocument/2006/relationships" xmlns:o="urn:schemas-microsoft-com:office:office" xmlns:v="urn:schemas-microsoft-com:vml" xmlns:w10="urn:schemas-microsoft-com:office:word" xmlns:a="http://schemas.openxmlformats.org/drawingml/2006/main" xmlns:pic="http://schemas.openxmlformats.org/drawingml/2006/picture" xmlns:wp="http://schemas.openxmlformats.org/drawingml/2006/wordprocessingDrawing">
   <w:body>
+    <w:p>
+      <w:pPr>
+        <w:pStyle w:val="Title"/>
+      </w:pPr>
+      <w:r>
+        <w:t xml:space="preserve">PECH Executive Summary</w:t>
+      </w:r>
+    </w:p>
     <w:bookmarkStart w:id="32" w:name="pech-group-holdings-ltd"/>
     <w:p>
       <w:pPr>
@@ -68,7 +76,7 @@
           <w:bCs/>
           <w:b/>
         </w:rPr>
-        <w:t xml:space="preserve">Capital Requirement:</w:t>
+        <w:t xml:space="preserve">Secured Capital:</w:t>
       </w:r>
       <w:r>
         <w:t xml:space="preserve"> </w:t>
@@ -117,7 +125,116 @@
       </w:r>
     </w:p>
     <w:bookmarkEnd w:id="20"/>
-    <w:bookmarkStart w:id="21" w:name="the-company"/>
+    <w:bookmarkStart w:id="21" w:name="our-mission"/>
+    <w:p>
+      <w:pPr>
+        <w:pStyle w:val="Heading2"/>
+      </w:pPr>
+      <w:r>
+        <w:t xml:space="preserve">Our Mission</w:t>
+      </w:r>
+    </w:p>
+    <w:p>
+      <w:pPr>
+        <w:pStyle w:val="FirstParagraph"/>
+      </w:pPr>
+      <w:r>
+        <w:t xml:space="preserve">PECH is a</w:t>
+      </w:r>
+      <w:r>
+        <w:t xml:space="preserve"> </w:t>
+      </w:r>
+      <w:r>
+        <w:rPr>
+          <w:bCs/>
+          <w:b/>
+        </w:rPr>
+        <w:t xml:space="preserve">technology and platform infrastructure enabler for people</w:t>
+      </w:r>
+      <w:r>
+        <w:t xml:space="preserve">. We build the digital backbone that African businesses, homes, and communities run on.</w:t>
+      </w:r>
+    </w:p>
+    <w:p>
+      <w:pPr>
+        <w:pStyle w:val="BodyText"/>
+      </w:pPr>
+      <w:r>
+        <w:t xml:space="preserve">Every product we ship represents</w:t>
+      </w:r>
+      <w:r>
+        <w:t xml:space="preserve"> </w:t>
+      </w:r>
+      <w:r>
+        <w:rPr>
+          <w:bCs/>
+          <w:b/>
+        </w:rPr>
+        <w:t xml:space="preserve">reliability, quality, and good price for your money</w:t>
+      </w:r>
+      <w:r>
+        <w:t xml:space="preserve">. We sell high-end products AND equally good affordable products, but</w:t>
+      </w:r>
+      <w:r>
+        <w:t xml:space="preserve"> </w:t>
+      </w:r>
+      <w:r>
+        <w:rPr>
+          <w:bCs/>
+          <w:b/>
+        </w:rPr>
+        <w:t xml:space="preserve">never bad products</w:t>
+      </w:r>
+      <w:r>
+        <w:t xml:space="preserve">. Quality is our brand promise.</w:t>
+      </w:r>
+    </w:p>
+    <w:p>
+      <w:pPr>
+        <w:pStyle w:val="BodyText"/>
+      </w:pPr>
+      <w:r>
+        <w:t xml:space="preserve">All PECH products are</w:t>
+      </w:r>
+      <w:r>
+        <w:t xml:space="preserve"> </w:t>
+      </w:r>
+      <w:r>
+        <w:rPr>
+          <w:bCs/>
+          <w:b/>
+        </w:rPr>
+        <w:t xml:space="preserve">designed for Africa</w:t>
+      </w:r>
+      <w:r>
+        <w:t xml:space="preserve"> </w:t>
+      </w:r>
+      <w:r>
+        <w:t xml:space="preserve">— wide voltage tolerance, heat resistance, dust/water protection, offline capability — and</w:t>
+      </w:r>
+      <w:r>
+        <w:t xml:space="preserve"> </w:t>
+      </w:r>
+      <w:r>
+        <w:rPr>
+          <w:bCs/>
+          <w:b/>
+        </w:rPr>
+        <w:t xml:space="preserve">progressively integrated across our entire ecosystem</w:t>
+      </w:r>
+      <w:r>
+        <w:t xml:space="preserve">: IoT platform, ERP, Marketplace, Logistics, and Payments.</w:t>
+      </w:r>
+    </w:p>
+    <w:p>
+      <w:r>
+        <w:pict>
+          <v:rect style="width:0;height:1.5pt" o:hralign="center" o:hrstd="t" o:hr="t"/>
+        </w:pict>
+      </w:r>
+    </w:p>
+    <w:bookmarkEnd w:id="21"/>
+    <w:bookmarkStart w:id="22" w:name="the-company"/>
     <w:p>
       <w:pPr>
         <w:pStyle w:val="Heading2"/>
@@ -157,39 +274,249 @@
         <w:t xml:space="preserve"> </w:t>
       </w:r>
       <w:r>
-        <w:t xml:space="preserve">— a multi-platform ecosystem that combines free business software (ERP), IoT smart systems, a digital marketplace, logistics infrastructure, payment processing, and smart hardware into a single unified platform.</w:t>
-      </w:r>
-    </w:p>
-    <w:p>
-      <w:pPr>
-        <w:pStyle w:val="BodyText"/>
-      </w:pPr>
-      <w:r>
-        <w:t xml:space="preserve">Our model mirrors the</w:t>
-      </w:r>
-      <w:r>
-        <w:t xml:space="preserve"> </w:t>
-      </w:r>
+        <w:t xml:space="preserve">— combining:</w:t>
+      </w:r>
+    </w:p>
+    <w:p>
+      <w:pPr>
+        <w:numPr>
+          <w:ilvl w:val="0"/>
+          <w:numId w:val="1001"/>
+        </w:numPr>
+        <w:pStyle w:val="Compact"/>
+      </w:pPr>
       <w:r>
         <w:rPr>
           <w:bCs/>
           <w:b/>
         </w:rPr>
-        <w:t xml:space="preserve">Alibaba Group architecture</w:t>
+        <w:t xml:space="preserve">Embedded ERP</w:t>
       </w:r>
       <w:r>
         <w:t xml:space="preserve"> </w:t>
       </w:r>
       <w:r>
-        <w:t xml:space="preserve">— adapted for African realities: offline-first, power-resilient, multi-network design. By giving African SMEs free ERP software and embedding payments, IoT monitoring, and logistics into daily business operations, PECH creates an ecosystem lock-in that no single-vertical competitor can match.</w:t>
-      </w:r>
-    </w:p>
-    <w:p>
-      <w:pPr>
-        <w:pStyle w:val="BodyText"/>
-      </w:pPr>
-      <w:r>
-        <w:t xml:space="preserve">Nigeria is the launchpad. With 90%+ of SMEs lacking digital tools, 80%+ relying on informal credit, and a $4.85B African IoT market growing rapidly — the timing is right.</w:t>
+        <w:t xml:space="preserve">— Free business management for SMEs</w:t>
+      </w:r>
+    </w:p>
+    <w:p>
+      <w:pPr>
+        <w:numPr>
+          <w:ilvl w:val="0"/>
+          <w:numId w:val="1001"/>
+        </w:numPr>
+        <w:pStyle w:val="Compact"/>
+      </w:pPr>
+      <w:r>
+        <w:rPr>
+          <w:bCs/>
+          <w:b/>
+        </w:rPr>
+        <w:t xml:space="preserve">IoT &amp; Smart Systems</w:t>
+      </w:r>
+      <w:r>
+        <w:t xml:space="preserve"> </w:t>
+      </w:r>
+      <w:r>
+        <w:t xml:space="preserve">— Energy, security, estate management platform</w:t>
+      </w:r>
+    </w:p>
+    <w:p>
+      <w:pPr>
+        <w:numPr>
+          <w:ilvl w:val="0"/>
+          <w:numId w:val="1001"/>
+        </w:numPr>
+        <w:pStyle w:val="Compact"/>
+      </w:pPr>
+      <w:r>
+        <w:rPr>
+          <w:bCs/>
+          <w:b/>
+        </w:rPr>
+        <w:t xml:space="preserve">Smart Water Controllers</w:t>
+      </w:r>
+      <w:r>
+        <w:t xml:space="preserve"> </w:t>
+      </w:r>
+      <w:r>
+        <w:t xml:space="preserve">— 4-tier water level controllers (Basic → Industrial/SCADA)</w:t>
+      </w:r>
+    </w:p>
+    <w:p>
+      <w:pPr>
+        <w:numPr>
+          <w:ilvl w:val="0"/>
+          <w:numId w:val="1001"/>
+        </w:numPr>
+        <w:pStyle w:val="Compact"/>
+      </w:pPr>
+      <w:r>
+        <w:rPr>
+          <w:bCs/>
+          <w:b/>
+        </w:rPr>
+        <w:t xml:space="preserve">Smart Home &amp; Electrical</w:t>
+      </w:r>
+      <w:r>
+        <w:t xml:space="preserve"> </w:t>
+      </w:r>
+      <w:r>
+        <w:t xml:space="preserve">— Switches, sockets, cameras (smart + non-smart)</w:t>
+      </w:r>
+    </w:p>
+    <w:p>
+      <w:pPr>
+        <w:numPr>
+          <w:ilvl w:val="0"/>
+          <w:numId w:val="1001"/>
+        </w:numPr>
+        <w:pStyle w:val="Compact"/>
+      </w:pPr>
+      <w:r>
+        <w:rPr>
+          <w:bCs/>
+          <w:b/>
+        </w:rPr>
+        <w:t xml:space="preserve">Learning Tablets &amp; EdTech</w:t>
+      </w:r>
+      <w:r>
+        <w:t xml:space="preserve"> </w:t>
+      </w:r>
+      <w:r>
+        <w:t xml:space="preserve">— Content deployment with open API for creators</w:t>
+      </w:r>
+    </w:p>
+    <w:p>
+      <w:pPr>
+        <w:numPr>
+          <w:ilvl w:val="0"/>
+          <w:numId w:val="1001"/>
+        </w:numPr>
+        <w:pStyle w:val="Compact"/>
+      </w:pPr>
+      <w:r>
+        <w:rPr>
+          <w:bCs/>
+          <w:b/>
+        </w:rPr>
+        <w:t xml:space="preserve">Marketplace</w:t>
+      </w:r>
+      <w:r>
+        <w:t xml:space="preserve"> </w:t>
+      </w:r>
+      <w:r>
+        <w:t xml:space="preserve">— Digital twin of Nigeria’s physical wholesale markets</w:t>
+      </w:r>
+    </w:p>
+    <w:p>
+      <w:pPr>
+        <w:numPr>
+          <w:ilvl w:val="0"/>
+          <w:numId w:val="1001"/>
+        </w:numPr>
+        <w:pStyle w:val="Compact"/>
+      </w:pPr>
+      <w:r>
+        <w:rPr>
+          <w:bCs/>
+          <w:b/>
+        </w:rPr>
+        <w:t xml:space="preserve">Spoke-and-Hub Logistics</w:t>
+      </w:r>
+      <w:r>
+        <w:t xml:space="preserve"> </w:t>
+      </w:r>
+      <w:r>
+        <w:t xml:space="preserve">— Cainiao-inspired parcel management</w:t>
+      </w:r>
+    </w:p>
+    <w:p>
+      <w:pPr>
+        <w:numPr>
+          <w:ilvl w:val="0"/>
+          <w:numId w:val="1001"/>
+        </w:numPr>
+        <w:pStyle w:val="Compact"/>
+      </w:pPr>
+      <w:r>
+        <w:rPr>
+          <w:bCs/>
+          <w:b/>
+        </w:rPr>
+        <w:t xml:space="preserve">Payments Infrastructure</w:t>
+      </w:r>
+      <w:r>
+        <w:t xml:space="preserve"> </w:t>
+      </w:r>
+      <w:r>
+        <w:t xml:space="preserve">— PSSP/PTSP payment processing</w:t>
+      </w:r>
+    </w:p>
+    <w:p>
+      <w:pPr>
+        <w:numPr>
+          <w:ilvl w:val="0"/>
+          <w:numId w:val="1001"/>
+        </w:numPr>
+        <w:pStyle w:val="Compact"/>
+      </w:pPr>
+      <w:r>
+        <w:rPr>
+          <w:bCs/>
+          <w:b/>
+        </w:rPr>
+        <w:t xml:space="preserve">Energy Storage Systems</w:t>
+      </w:r>
+      <w:r>
+        <w:t xml:space="preserve"> </w:t>
+      </w:r>
+      <w:r>
+        <w:t xml:space="preserve">— Battery backups for IoT and homes</w:t>
+      </w:r>
+    </w:p>
+    <w:p>
+      <w:pPr>
+        <w:numPr>
+          <w:ilvl w:val="0"/>
+          <w:numId w:val="1001"/>
+        </w:numPr>
+        <w:pStyle w:val="Compact"/>
+      </w:pPr>
+      <w:r>
+        <w:rPr>
+          <w:bCs/>
+          <w:b/>
+        </w:rPr>
+        <w:t xml:space="preserve">Advertising &amp; LED Displays</w:t>
+      </w:r>
+      <w:r>
+        <w:t xml:space="preserve"> </w:t>
+      </w:r>
+      <w:r>
+        <w:t xml:space="preserve">— Digital signage infrastructure (Phase 2)</w:t>
+      </w:r>
+    </w:p>
+    <w:p>
+      <w:pPr>
+        <w:numPr>
+          <w:ilvl w:val="0"/>
+          <w:numId w:val="1001"/>
+        </w:numPr>
+        <w:pStyle w:val="Compact"/>
+      </w:pPr>
+      <w:r>
+        <w:rPr>
+          <w:bCs/>
+          <w:b/>
+        </w:rPr>
+        <w:t xml:space="preserve">Self-Service Kiosks</w:t>
+      </w:r>
+      <w:r>
+        <w:t xml:space="preserve"> </w:t>
+      </w:r>
+      <w:r>
+        <w:t xml:space="preserve">— Multi-purpose payment/info terminals</w:t>
       </w:r>
     </w:p>
     <w:p>
@@ -199,8 +526,8 @@
         </w:pict>
       </w:r>
     </w:p>
-    <w:bookmarkEnd w:id="21"/>
-    <w:bookmarkStart w:id="22" w:name="secured-capital"/>
+    <w:bookmarkEnd w:id="22"/>
+    <w:bookmarkStart w:id="23" w:name="secured-capital"/>
     <w:p>
       <w:pPr>
         <w:pStyle w:val="Heading2"/>
@@ -224,7 +551,7 @@
         <w:t xml:space="preserve"> </w:t>
       </w:r>
       <w:r>
-        <w:t xml:space="preserve">in committed capital to deploy across the first 18 months of simultaneous lean platform launches across 6 verticals. Additional capital will be injected by the investor as the business gains traction.</w:t>
+        <w:t xml:space="preserve">committed capital for the first 18 months. The investor will inject additional capital as the business gains traction.</w:t>
       </w:r>
     </w:p>
     <w:p>
@@ -234,8 +561,8 @@
         </w:pict>
       </w:r>
     </w:p>
-    <w:bookmarkEnd w:id="22"/>
-    <w:bookmarkStart w:id="23" w:name="budget-allocation"/>
+    <w:bookmarkEnd w:id="23"/>
+    <w:bookmarkStart w:id="24" w:name="budget-allocation"/>
     <w:p>
       <w:pPr>
         <w:pStyle w:val="Heading2"/>
@@ -310,31 +637,31 @@
                 <w:bCs/>
                 <w:b/>
               </w:rPr>
-              <w:t xml:space="preserve">Human Capital (Salaries &amp; Contractors)</w:t>
-            </w:r>
-          </w:p>
-        </w:tc>
-        <w:tc>
-          <w:tcPr/>
-          <w:p>
-            <w:pPr>
-              <w:pStyle w:val="Compact"/>
-              <w:jc w:val="left"/>
-            </w:pPr>
-            <w:r>
-              <w:t xml:space="preserve">₦82,000,000</w:t>
-            </w:r>
-          </w:p>
-        </w:tc>
-        <w:tc>
-          <w:tcPr/>
-          <w:p>
-            <w:pPr>
-              <w:pStyle w:val="Compact"/>
-              <w:jc w:val="left"/>
-            </w:pPr>
-            <w:r>
-              <w:t xml:space="preserve">32.8%</w:t>
+              <w:t xml:space="preserve">Hardware Procurement (23 SKUs from China)</w:t>
+            </w:r>
+          </w:p>
+        </w:tc>
+        <w:tc>
+          <w:tcPr/>
+          <w:p>
+            <w:pPr>
+              <w:pStyle w:val="Compact"/>
+              <w:jc w:val="left"/>
+            </w:pPr>
+            <w:r>
+              <w:t xml:space="preserve">₦75,000,000</w:t>
+            </w:r>
+          </w:p>
+        </w:tc>
+        <w:tc>
+          <w:tcPr/>
+          <w:p>
+            <w:pPr>
+              <w:pStyle w:val="Compact"/>
+              <w:jc w:val="left"/>
+            </w:pPr>
+            <w:r>
+              <w:t xml:space="preserve">30.0%</w:t>
             </w:r>
           </w:p>
         </w:tc>
@@ -352,31 +679,31 @@
                 <w:bCs/>
                 <w:b/>
               </w:rPr>
-              <w:t xml:space="preserve">Hardware Procurement (China Sourcing)</w:t>
-            </w:r>
-          </w:p>
-        </w:tc>
-        <w:tc>
-          <w:tcPr/>
-          <w:p>
-            <w:pPr>
-              <w:pStyle w:val="Compact"/>
-              <w:jc w:val="left"/>
-            </w:pPr>
-            <w:r>
-              <w:t xml:space="preserve">₦52,000,000</w:t>
-            </w:r>
-          </w:p>
-        </w:tc>
-        <w:tc>
-          <w:tcPr/>
-          <w:p>
-            <w:pPr>
-              <w:pStyle w:val="Compact"/>
-              <w:jc w:val="left"/>
-            </w:pPr>
-            <w:r>
-              <w:t xml:space="preserve">20.8%</w:t>
+              <w:t xml:space="preserve">Human Capital (Salaries &amp; Contractors)</w:t>
+            </w:r>
+          </w:p>
+        </w:tc>
+        <w:tc>
+          <w:tcPr/>
+          <w:p>
+            <w:pPr>
+              <w:pStyle w:val="Compact"/>
+              <w:jc w:val="left"/>
+            </w:pPr>
+            <w:r>
+              <w:t xml:space="preserve">₦70,000,000</w:t>
+            </w:r>
+          </w:p>
+        </w:tc>
+        <w:tc>
+          <w:tcPr/>
+          <w:p>
+            <w:pPr>
+              <w:pStyle w:val="Compact"/>
+              <w:jc w:val="left"/>
+            </w:pPr>
+            <w:r>
+              <w:t xml:space="preserve">28.0%</w:t>
             </w:r>
           </w:p>
         </w:tc>
@@ -436,31 +763,31 @@
                 <w:bCs/>
                 <w:b/>
               </w:rPr>
-              <w:t xml:space="preserve">Licensing, Legal &amp; Compliance</w:t>
-            </w:r>
-          </w:p>
-        </w:tc>
-        <w:tc>
-          <w:tcPr/>
-          <w:p>
-            <w:pPr>
-              <w:pStyle w:val="Compact"/>
-              <w:jc w:val="left"/>
-            </w:pPr>
-            <w:r>
-              <w:t xml:space="preserve">₦18,750,000</w:t>
-            </w:r>
-          </w:p>
-        </w:tc>
-        <w:tc>
-          <w:tcPr/>
-          <w:p>
-            <w:pPr>
-              <w:pStyle w:val="Compact"/>
-              <w:jc w:val="left"/>
-            </w:pPr>
-            <w:r>
-              <w:t xml:space="preserve">7.5%</w:t>
+              <w:t xml:space="preserve">Marketing &amp; Customer Acquisition</w:t>
+            </w:r>
+          </w:p>
+        </w:tc>
+        <w:tc>
+          <w:tcPr/>
+          <w:p>
+            <w:pPr>
+              <w:pStyle w:val="Compact"/>
+              <w:jc w:val="left"/>
+            </w:pPr>
+            <w:r>
+              <w:t xml:space="preserve">₦22,000,000</w:t>
+            </w:r>
+          </w:p>
+        </w:tc>
+        <w:tc>
+          <w:tcPr/>
+          <w:p>
+            <w:pPr>
+              <w:pStyle w:val="Compact"/>
+              <w:jc w:val="left"/>
+            </w:pPr>
+            <w:r>
+              <w:t xml:space="preserve">8.8%</w:t>
             </w:r>
           </w:p>
         </w:tc>
@@ -478,31 +805,31 @@
                 <w:bCs/>
                 <w:b/>
               </w:rPr>
-              <w:t xml:space="preserve">Marketing &amp; Customer Acquisition</w:t>
-            </w:r>
-          </w:p>
-        </w:tc>
-        <w:tc>
-          <w:tcPr/>
-          <w:p>
-            <w:pPr>
-              <w:pStyle w:val="Compact"/>
-              <w:jc w:val="left"/>
-            </w:pPr>
-            <w:r>
-              <w:t xml:space="preserve">₦22,000,000</w:t>
-            </w:r>
-          </w:p>
-        </w:tc>
-        <w:tc>
-          <w:tcPr/>
-          <w:p>
-            <w:pPr>
-              <w:pStyle w:val="Compact"/>
-              <w:jc w:val="left"/>
-            </w:pPr>
-            <w:r>
-              <w:t xml:space="preserve">8.8%</w:t>
+              <w:t xml:space="preserve">Contingency &amp; FX Reserve</w:t>
+            </w:r>
+          </w:p>
+        </w:tc>
+        <w:tc>
+          <w:tcPr/>
+          <w:p>
+            <w:pPr>
+              <w:pStyle w:val="Compact"/>
+              <w:jc w:val="left"/>
+            </w:pPr>
+            <w:r>
+              <w:t xml:space="preserve">₦21,000,000</w:t>
+            </w:r>
+          </w:p>
+        </w:tc>
+        <w:tc>
+          <w:tcPr/>
+          <w:p>
+            <w:pPr>
+              <w:pStyle w:val="Compact"/>
+              <w:jc w:val="left"/>
+            </w:pPr>
+            <w:r>
+              <w:t xml:space="preserve">8.4%</w:t>
             </w:r>
           </w:p>
         </w:tc>
@@ -604,31 +931,31 @@
                 <w:bCs/>
                 <w:b/>
               </w:rPr>
-              <w:t xml:space="preserve">Contingency &amp; Emergency Reserve</w:t>
-            </w:r>
-          </w:p>
-        </w:tc>
-        <w:tc>
-          <w:tcPr/>
-          <w:p>
-            <w:pPr>
-              <w:pStyle w:val="Compact"/>
-              <w:jc w:val="left"/>
-            </w:pPr>
-            <w:r>
-              <w:t xml:space="preserve">₦13,250,000</w:t>
-            </w:r>
-          </w:p>
-        </w:tc>
-        <w:tc>
-          <w:tcPr/>
-          <w:p>
-            <w:pPr>
-              <w:pStyle w:val="Compact"/>
-              <w:jc w:val="left"/>
-            </w:pPr>
-            <w:r>
-              <w:t xml:space="preserve">5.3%</w:t>
+              <w:t xml:space="preserve">Licensing, Legal &amp; Compliance</w:t>
+            </w:r>
+          </w:p>
+        </w:tc>
+        <w:tc>
+          <w:tcPr/>
+          <w:p>
+            <w:pPr>
+              <w:pStyle w:val="Compact"/>
+              <w:jc w:val="left"/>
+            </w:pPr>
+            <w:r>
+              <w:t xml:space="preserve">₦10,000,000</w:t>
+            </w:r>
+          </w:p>
+        </w:tc>
+        <w:tc>
+          <w:tcPr/>
+          <w:p>
+            <w:pPr>
+              <w:pStyle w:val="Compact"/>
+              <w:jc w:val="left"/>
+            </w:pPr>
+            <w:r>
+              <w:t xml:space="preserve">4.0%</w:t>
             </w:r>
           </w:p>
         </w:tc>
@@ -692,7 +1019,7 @@
         <w:rPr>
           <w:rStyle w:val="VerbatimChar"/>
         </w:rPr>
-        <w:t xml:space="preserve">  Human Capital     ████████████████████████████████░  32.8%  ₦82M</w:t>
+        <w:t xml:space="preserve">  Hardware (23 SKUs)██████████████████████████████░░  30.0%  ₦75M</w:t>
       </w:r>
       <w:r>
         <w:br/>
@@ -701,7 +1028,7 @@
         <w:rPr>
           <w:rStyle w:val="VerbatimChar"/>
         </w:rPr>
-        <w:t xml:space="preserve">  Hardware          ████████████████████░░░░░░░░░░░░  20.8%  ₦52M</w:t>
+        <w:t xml:space="preserve">  Human Capital     ████████████████████████████░░░░  28.0%  ₦70M</w:t>
       </w:r>
       <w:r>
         <w:br/>
@@ -728,7 +1055,7 @@
         <w:rPr>
           <w:rStyle w:val="VerbatimChar"/>
         </w:rPr>
-        <w:t xml:space="preserve">  Legal/Compliance  ███████░░░░░░░░░░░░░░░░░░░░░░░░   7.5%  ₦18.75M</w:t>
+        <w:t xml:space="preserve">  Contingency/FX    ████████░░░░░░░░░░░░░░░░░░░░░░░   8.4%  ₦21M</w:t>
       </w:r>
       <w:r>
         <w:br/>
@@ -746,7 +1073,7 @@
         <w:rPr>
           <w:rStyle w:val="VerbatimChar"/>
         </w:rPr>
-        <w:t xml:space="preserve">  Contingency       █████░░░░░░░░░░░░░░░░░░░░░░░░░░   5.3%  ₦13.25M</w:t>
+        <w:t xml:space="preserve">  Logistics Setup   ████░░░░░░░░░░░░░░░░░░░░░░░░░░░   4.8%  ₦12M</w:t>
       </w:r>
       <w:r>
         <w:br/>
@@ -755,7 +1082,7 @@
         <w:rPr>
           <w:rStyle w:val="VerbatimChar"/>
         </w:rPr>
-        <w:t xml:space="preserve">  Logistics Setup   ████░░░░░░░░░░░░░░░░░░░░░░░░░░░   4.8%  ₦12M</w:t>
+        <w:t xml:space="preserve">  Legal/Compliance  ████░░░░░░░░░░░░░░░░░░░░░░░░░░░   4.0%  ₦10M</w:t>
       </w:r>
     </w:p>
     <w:p>
@@ -765,8 +1092,289 @@
         </w:pict>
       </w:r>
     </w:p>
-    <w:bookmarkEnd w:id="23"/>
-    <w:bookmarkStart w:id="24" w:name="month-execution-roadmap"/>
+    <w:bookmarkEnd w:id="24"/>
+    <w:bookmarkStart w:id="25" w:name="hardware-portfolio-23-skus"/>
+    <w:p>
+      <w:pPr>
+        <w:pStyle w:val="Heading2"/>
+      </w:pPr>
+      <w:r>
+        <w:t xml:space="preserve">Hardware Portfolio (23 SKUs)</w:t>
+      </w:r>
+    </w:p>
+    <w:tbl>
+      <w:tblPr>
+        <w:tblStyle w:val="Table"/>
+        <w:tblW w:type="pct" w:w="5000"/>
+        <w:tblLook w:firstRow="1" w:lastRow="0" w:firstColumn="0" w:lastColumn="0" w:noHBand="0" w:noVBand="0" w:val="0020"/>
+        <w:jc w:val="start"/>
+      </w:tblPr>
+      <w:tblGrid>
+        <w:gridCol w:w="2262"/>
+        <w:gridCol w:w="2036"/>
+        <w:gridCol w:w="3620"/>
+      </w:tblGrid>
+      <w:tr>
+        <w:trPr>
+          <w:tblHeader w:val="true"/>
+        </w:trPr>
+        <w:tc>
+          <w:tcPr/>
+          <w:p>
+            <w:pPr>
+              <w:pStyle w:val="Compact"/>
+              <w:jc w:val="left"/>
+            </w:pPr>
+            <w:r>
+              <w:t xml:space="preserve">Category</w:t>
+            </w:r>
+          </w:p>
+        </w:tc>
+        <w:tc>
+          <w:tcPr/>
+          <w:p>
+            <w:pPr>
+              <w:pStyle w:val="Compact"/>
+              <w:jc w:val="left"/>
+            </w:pPr>
+            <w:r>
+              <w:t xml:space="preserve">Products</w:t>
+            </w:r>
+          </w:p>
+        </w:tc>
+        <w:tc>
+          <w:tcPr/>
+          <w:p>
+            <w:pPr>
+              <w:pStyle w:val="Compact"/>
+              <w:jc w:val="left"/>
+            </w:pPr>
+            <w:r>
+              <w:t xml:space="preserve">Price Range (₦)</w:t>
+            </w:r>
+          </w:p>
+        </w:tc>
+      </w:tr>
+      <w:tr>
+        <w:tc>
+          <w:tcPr/>
+          <w:p>
+            <w:pPr>
+              <w:pStyle w:val="Compact"/>
+              <w:jc w:val="left"/>
+            </w:pPr>
+            <w:r>
+              <w:rPr>
+                <w:bCs/>
+                <w:b/>
+              </w:rPr>
+              <w:t xml:space="preserve">Commerce</w:t>
+            </w:r>
+          </w:p>
+        </w:tc>
+        <w:tc>
+          <w:tcPr/>
+          <w:p>
+            <w:pPr>
+              <w:pStyle w:val="Compact"/>
+              <w:jc w:val="left"/>
+            </w:pPr>
+            <w:r>
+              <w:t xml:space="preserve">Smart POS, POS Tablet, Self-Service Kiosk, Barcode/Receipt Kit, Logistics Scanner</w:t>
+            </w:r>
+          </w:p>
+        </w:tc>
+        <w:tc>
+          <w:tcPr/>
+          <w:p>
+            <w:pPr>
+              <w:pStyle w:val="Compact"/>
+              <w:jc w:val="left"/>
+            </w:pPr>
+            <w:r>
+              <w:t xml:space="preserve">₦28K–₦250K</w:t>
+            </w:r>
+          </w:p>
+        </w:tc>
+      </w:tr>
+      <w:tr>
+        <w:tc>
+          <w:tcPr/>
+          <w:p>
+            <w:pPr>
+              <w:pStyle w:val="Compact"/>
+              <w:jc w:val="left"/>
+            </w:pPr>
+            <w:r>
+              <w:rPr>
+                <w:bCs/>
+                <w:b/>
+              </w:rPr>
+              <w:t xml:space="preserve">IoT &amp; Energy</w:t>
+            </w:r>
+          </w:p>
+        </w:tc>
+        <w:tc>
+          <w:tcPr/>
+          <w:p>
+            <w:pPr>
+              <w:pStyle w:val="Compact"/>
+              <w:jc w:val="left"/>
+            </w:pPr>
+            <w:r>
+              <w:t xml:space="preserve">Energy Controller, Smart Meter, Power Kit, Mini UPS, Home Battery</w:t>
+            </w:r>
+          </w:p>
+        </w:tc>
+        <w:tc>
+          <w:tcPr/>
+          <w:p>
+            <w:pPr>
+              <w:pStyle w:val="Compact"/>
+              <w:jc w:val="left"/>
+            </w:pPr>
+            <w:r>
+              <w:t xml:space="preserve">₦20K–₦130K</w:t>
+            </w:r>
+          </w:p>
+        </w:tc>
+      </w:tr>
+      <w:tr>
+        <w:tc>
+          <w:tcPr/>
+          <w:p>
+            <w:pPr>
+              <w:pStyle w:val="Compact"/>
+              <w:jc w:val="left"/>
+            </w:pPr>
+            <w:r>
+              <w:rPr>
+                <w:bCs/>
+                <w:b/>
+              </w:rPr>
+              <w:t xml:space="preserve">Water Controllers</w:t>
+            </w:r>
+          </w:p>
+        </w:tc>
+        <w:tc>
+          <w:tcPr/>
+          <w:p>
+            <w:pPr>
+              <w:pStyle w:val="Compact"/>
+              <w:jc w:val="left"/>
+            </w:pPr>
+            <w:r>
+              <w:t xml:space="preserve">Tier 1 Basic, Tier 2 Mid-Range, Tier 3 Smart IoT, Tier 4 Industrial/SCADA</w:t>
+            </w:r>
+          </w:p>
+        </w:tc>
+        <w:tc>
+          <w:tcPr/>
+          <w:p>
+            <w:pPr>
+              <w:pStyle w:val="Compact"/>
+              <w:jc w:val="left"/>
+            </w:pPr>
+            <w:r>
+              <w:t xml:space="preserve">₦15K–₦120K</w:t>
+            </w:r>
+          </w:p>
+        </w:tc>
+      </w:tr>
+      <w:tr>
+        <w:tc>
+          <w:tcPr/>
+          <w:p>
+            <w:pPr>
+              <w:pStyle w:val="Compact"/>
+              <w:jc w:val="left"/>
+            </w:pPr>
+            <w:r>
+              <w:rPr>
+                <w:bCs/>
+                <w:b/>
+              </w:rPr>
+              <w:t xml:space="preserve">Smart Home</w:t>
+            </w:r>
+          </w:p>
+        </w:tc>
+        <w:tc>
+          <w:tcPr/>
+          <w:p>
+            <w:pPr>
+              <w:pStyle w:val="Compact"/>
+              <w:jc w:val="left"/>
+            </w:pPr>
+            <w:r>
+              <w:t xml:space="preserve">Smart Switch, Smart Socket, Smart Camera, IP Camera, Premium Switch/Socket</w:t>
+            </w:r>
+          </w:p>
+        </w:tc>
+        <w:tc>
+          <w:tcPr/>
+          <w:p>
+            <w:pPr>
+              <w:pStyle w:val="Compact"/>
+              <w:jc w:val="left"/>
+            </w:pPr>
+            <w:r>
+              <w:t xml:space="preserve">₦1.5K–₦30K</w:t>
+            </w:r>
+          </w:p>
+        </w:tc>
+      </w:tr>
+      <w:tr>
+        <w:tc>
+          <w:tcPr/>
+          <w:p>
+            <w:pPr>
+              <w:pStyle w:val="Compact"/>
+              <w:jc w:val="left"/>
+            </w:pPr>
+            <w:r>
+              <w:rPr>
+                <w:bCs/>
+                <w:b/>
+              </w:rPr>
+              <w:t xml:space="preserve">Education &amp; Display</w:t>
+            </w:r>
+          </w:p>
+        </w:tc>
+        <w:tc>
+          <w:tcPr/>
+          <w:p>
+            <w:pPr>
+              <w:pStyle w:val="Compact"/>
+              <w:jc w:val="left"/>
+            </w:pPr>
+            <w:r>
+              <w:t xml:space="preserve">Learning Tablet, Indoor LED Panel, Outdoor LED Screen</w:t>
+            </w:r>
+          </w:p>
+        </w:tc>
+        <w:tc>
+          <w:tcPr/>
+          <w:p>
+            <w:pPr>
+              <w:pStyle w:val="Compact"/>
+              <w:jc w:val="left"/>
+            </w:pPr>
+            <w:r>
+              <w:t xml:space="preserve">₦45K–₦140K</w:t>
+            </w:r>
+          </w:p>
+        </w:tc>
+      </w:tr>
+    </w:tbl>
+    <w:p>
+      <w:r>
+        <w:pict>
+          <v:rect style="width:0;height:1.5pt" o:hralign="center" o:hrstd="t" o:hr="t"/>
+        </w:pict>
+      </w:r>
+    </w:p>
+    <w:bookmarkEnd w:id="25"/>
+    <w:bookmarkStart w:id="26" w:name="month-execution-roadmap"/>
     <w:p>
       <w:pPr>
         <w:pStyle w:val="Heading2"/>
@@ -878,7 +1486,7 @@
               <w:jc w:val="left"/>
             </w:pPr>
             <w:r>
-              <w:t xml:space="preserve">Core team (7 people), architecture, first hardware order from China, legal setup</w:t>
+              <w:t xml:space="preserve">Core team (5 people), architecture, first hardware order, legal setup</w:t>
             </w:r>
           </w:p>
         </w:tc>
@@ -932,7 +1540,7 @@
               <w:jc w:val="left"/>
             </w:pPr>
             <w:r>
-              <w:t xml:space="preserve">Pilot 50 merchants, 30 IoT devices, 2 logistics stations, payment integration</w:t>
+              <w:t xml:space="preserve">50 merchants, 30 IoT devices, 2 logistics stations, smart home launch</w:t>
             </w:r>
           </w:p>
         </w:tc>
@@ -986,7 +1594,7 @@
               <w:jc w:val="left"/>
             </w:pPr>
             <w:r>
-              <w:t xml:space="preserve">500 merchants, 3 markets, PSSP application filed, marketing campaigns</w:t>
+              <w:t xml:space="preserve">500 merchants, 3 markets, water controllers launch, marketing campaigns</w:t>
             </w:r>
           </w:p>
         </w:tc>
@@ -1040,7 +1648,7 @@
               <w:jc w:val="left"/>
             </w:pPr>
             <w:r>
-              <w:t xml:space="preserve">1,500 merchants, 300 devices, ₦100M+/month payment volume, credit scoring prototype</w:t>
+              <w:t xml:space="preserve">1,500 merchants, 300 devices, credit scoring prototype</w:t>
             </w:r>
           </w:p>
         </w:tc>
@@ -1070,7 +1678,7 @@
                 <w:bCs/>
                 <w:b/>
               </w:rPr>
-              <w:t xml:space="preserve">Phase 5: Ecosystem Maturity</w:t>
+              <w:t xml:space="preserve">Phase 5: Maturity</w:t>
             </w:r>
           </w:p>
         </w:tc>
@@ -1094,7 +1702,7 @@
               <w:jc w:val="left"/>
             </w:pPr>
             <w:r>
-              <w:t xml:space="preserve">3,000 merchants, 800 devices, PSSP license, API launch, West Africa research</w:t>
+              <w:t xml:space="preserve">3,000 merchants, 800 devices, API launch, LED displays, West Africa research</w:t>
             </w:r>
           </w:p>
         </w:tc>
@@ -1119,8 +1727,8 @@
         </w:pict>
       </w:r>
     </w:p>
-    <w:bookmarkEnd w:id="24"/>
-    <w:bookmarkStart w:id="25" w:name="key-targets-18-months"/>
+    <w:bookmarkEnd w:id="26"/>
+    <w:bookmarkStart w:id="27" w:name="key-targets-18-months"/>
     <w:p>
       <w:pPr>
         <w:pStyle w:val="Heading2"/>
@@ -1354,56 +1962,6 @@
               <w:jc w:val="left"/>
             </w:pPr>
             <w:r>
-              <w:t xml:space="preserve">Spoke Stations Active</w:t>
-            </w:r>
-          </w:p>
-        </w:tc>
-        <w:tc>
-          <w:tcPr/>
-          <w:p>
-            <w:pPr>
-              <w:pStyle w:val="Compact"/>
-              <w:jc w:val="left"/>
-            </w:pPr>
-            <w:r>
-              <w:t xml:space="preserve">2</w:t>
-            </w:r>
-          </w:p>
-        </w:tc>
-        <w:tc>
-          <w:tcPr/>
-          <w:p>
-            <w:pPr>
-              <w:pStyle w:val="Compact"/>
-              <w:jc w:val="left"/>
-            </w:pPr>
-            <w:r>
-              <w:t xml:space="preserve">10</w:t>
-            </w:r>
-          </w:p>
-        </w:tc>
-        <w:tc>
-          <w:tcPr/>
-          <w:p>
-            <w:pPr>
-              <w:pStyle w:val="Compact"/>
-              <w:jc w:val="left"/>
-            </w:pPr>
-            <w:r>
-              <w:t xml:space="preserve">20</w:t>
-            </w:r>
-          </w:p>
-        </w:tc>
-      </w:tr>
-      <w:tr>
-        <w:tc>
-          <w:tcPr/>
-          <w:p>
-            <w:pPr>
-              <w:pStyle w:val="Compact"/>
-              <w:jc w:val="left"/>
-            </w:pPr>
-            <w:r>
               <w:t xml:space="preserve">Monthly Revenue (₦)</w:t>
             </w:r>
           </w:p>
@@ -1454,56 +2012,6 @@
               <w:jc w:val="left"/>
             </w:pPr>
             <w:r>
-              <w:t xml:space="preserve">Payment GMV (₦/month)</w:t>
-            </w:r>
-          </w:p>
-        </w:tc>
-        <w:tc>
-          <w:tcPr/>
-          <w:p>
-            <w:pPr>
-              <w:pStyle w:val="Compact"/>
-              <w:jc w:val="left"/>
-            </w:pPr>
-            <w:r>
-              <w:t xml:space="preserve">20M</w:t>
-            </w:r>
-          </w:p>
-        </w:tc>
-        <w:tc>
-          <w:tcPr/>
-          <w:p>
-            <w:pPr>
-              <w:pStyle w:val="Compact"/>
-              <w:jc w:val="left"/>
-            </w:pPr>
-            <w:r>
-              <w:t xml:space="preserve">150M</w:t>
-            </w:r>
-          </w:p>
-        </w:tc>
-        <w:tc>
-          <w:tcPr/>
-          <w:p>
-            <w:pPr>
-              <w:pStyle w:val="Compact"/>
-              <w:jc w:val="left"/>
-            </w:pPr>
-            <w:r>
-              <w:t xml:space="preserve">500M</w:t>
-            </w:r>
-          </w:p>
-        </w:tc>
-      </w:tr>
-      <w:tr>
-        <w:tc>
-          <w:tcPr/>
-          <w:p>
-            <w:pPr>
-              <w:pStyle w:val="Compact"/>
-              <w:jc w:val="left"/>
-            </w:pPr>
-            <w:r>
               <w:t xml:space="preserve">Team Size</w:t>
             </w:r>
           </w:p>
@@ -1516,500 +2024,31 @@
               <w:jc w:val="left"/>
             </w:pPr>
             <w:r>
-              <w:t xml:space="preserve">12</w:t>
-            </w:r>
-          </w:p>
-        </w:tc>
-        <w:tc>
-          <w:tcPr/>
-          <w:p>
-            <w:pPr>
-              <w:pStyle w:val="Compact"/>
-              <w:jc w:val="left"/>
-            </w:pPr>
-            <w:r>
-              <w:t xml:space="preserve">25</w:t>
-            </w:r>
-          </w:p>
-        </w:tc>
-        <w:tc>
-          <w:tcPr/>
-          <w:p>
-            <w:pPr>
-              <w:pStyle w:val="Compact"/>
-              <w:jc w:val="left"/>
-            </w:pPr>
-            <w:r>
-              <w:t xml:space="preserve">35</w:t>
-            </w:r>
-          </w:p>
-        </w:tc>
-      </w:tr>
-    </w:tbl>
-    <w:p>
-      <w:r>
-        <w:pict>
-          <v:rect style="width:0;height:1.5pt" o:hralign="center" o:hrstd="t" o:hr="t"/>
-        </w:pict>
-      </w:r>
-    </w:p>
-    <w:bookmarkEnd w:id="25"/>
-    <w:bookmarkStart w:id="26" w:name="revenue-projections"/>
-    <w:p>
-      <w:pPr>
-        <w:pStyle w:val="Heading2"/>
-      </w:pPr>
-      <w:r>
-        <w:t xml:space="preserve">Revenue Projections</w:t>
-      </w:r>
-    </w:p>
-    <w:tbl>
-      <w:tblPr>
-        <w:tblStyle w:val="Table"/>
-        <w:tblW w:type="pct" w:w="5000"/>
-        <w:tblLook w:firstRow="1" w:lastRow="0" w:firstColumn="0" w:lastColumn="0" w:noHBand="0" w:noVBand="0" w:val="0020"/>
-        <w:jc w:val="start"/>
-      </w:tblPr>
-      <w:tblGrid>
-        <w:gridCol w:w="1018"/>
-        <w:gridCol w:w="905"/>
-        <w:gridCol w:w="2036"/>
-        <w:gridCol w:w="2489"/>
-        <w:gridCol w:w="1470"/>
-      </w:tblGrid>
-      <w:tr>
-        <w:trPr>
-          <w:tblHeader w:val="true"/>
-        </w:trPr>
-        <w:tc>
-          <w:tcPr/>
-          <w:p>
-            <w:pPr>
-              <w:pStyle w:val="Compact"/>
-              <w:jc w:val="left"/>
-            </w:pPr>
-            <w:r>
-              <w:t xml:space="preserve">Quarter</w:t>
-            </w:r>
-          </w:p>
-        </w:tc>
-        <w:tc>
-          <w:tcPr/>
-          <w:p>
-            <w:pPr>
-              <w:pStyle w:val="Compact"/>
-              <w:jc w:val="left"/>
-            </w:pPr>
-            <w:r>
-              <w:t xml:space="preserve">Months</w:t>
-            </w:r>
-          </w:p>
-        </w:tc>
-        <w:tc>
-          <w:tcPr/>
-          <w:p>
-            <w:pPr>
-              <w:pStyle w:val="Compact"/>
-              <w:jc w:val="left"/>
-            </w:pPr>
-            <w:r>
-              <w:t xml:space="preserve">Monthly Burn (₦)</w:t>
-            </w:r>
-          </w:p>
-        </w:tc>
-        <w:tc>
-          <w:tcPr/>
-          <w:p>
-            <w:pPr>
-              <w:pStyle w:val="Compact"/>
-              <w:jc w:val="left"/>
-            </w:pPr>
-            <w:r>
-              <w:t xml:space="preserve">Cumulative Spend (₦)</w:t>
-            </w:r>
-          </w:p>
-        </w:tc>
-        <w:tc>
-          <w:tcPr/>
-          <w:p>
-            <w:pPr>
-              <w:pStyle w:val="Compact"/>
-              <w:jc w:val="left"/>
-            </w:pPr>
-            <w:r>
-              <w:t xml:space="preserve">Revenue (₦)</w:t>
-            </w:r>
-          </w:p>
-        </w:tc>
-      </w:tr>
-      <w:tr>
-        <w:tc>
-          <w:tcPr/>
-          <w:p>
-            <w:pPr>
-              <w:pStyle w:val="Compact"/>
-              <w:jc w:val="left"/>
-            </w:pPr>
-            <w:r>
-              <w:t xml:space="preserve">Q1</w:t>
-            </w:r>
-          </w:p>
-        </w:tc>
-        <w:tc>
-          <w:tcPr/>
-          <w:p>
-            <w:pPr>
-              <w:pStyle w:val="Compact"/>
-              <w:jc w:val="left"/>
-            </w:pPr>
-            <w:r>
-              <w:t xml:space="preserve">1–3</w:t>
-            </w:r>
-          </w:p>
-        </w:tc>
-        <w:tc>
-          <w:tcPr/>
-          <w:p>
-            <w:pPr>
-              <w:pStyle w:val="Compact"/>
-              <w:jc w:val="left"/>
-            </w:pPr>
-            <w:r>
-              <w:t xml:space="preserve">₦14.0M</w:t>
-            </w:r>
-          </w:p>
-        </w:tc>
-        <w:tc>
-          <w:tcPr/>
-          <w:p>
-            <w:pPr>
-              <w:pStyle w:val="Compact"/>
-              <w:jc w:val="left"/>
-            </w:pPr>
-            <w:r>
-              <w:t xml:space="preserve">₦42.0M</w:t>
-            </w:r>
-          </w:p>
-        </w:tc>
-        <w:tc>
-          <w:tcPr/>
-          <w:p>
-            <w:pPr>
-              <w:pStyle w:val="Compact"/>
-              <w:jc w:val="left"/>
-            </w:pPr>
-            <w:r>
-              <w:t xml:space="preserve">₦0</w:t>
-            </w:r>
-          </w:p>
-        </w:tc>
-      </w:tr>
-      <w:tr>
-        <w:tc>
-          <w:tcPr/>
-          <w:p>
-            <w:pPr>
-              <w:pStyle w:val="Compact"/>
-              <w:jc w:val="left"/>
-            </w:pPr>
-            <w:r>
-              <w:t xml:space="preserve">Q2</w:t>
-            </w:r>
-          </w:p>
-        </w:tc>
-        <w:tc>
-          <w:tcPr/>
-          <w:p>
-            <w:pPr>
-              <w:pStyle w:val="Compact"/>
-              <w:jc w:val="left"/>
-            </w:pPr>
-            <w:r>
-              <w:t xml:space="preserve">4–6</w:t>
-            </w:r>
-          </w:p>
-        </w:tc>
-        <w:tc>
-          <w:tcPr/>
-          <w:p>
-            <w:pPr>
-              <w:pStyle w:val="Compact"/>
-              <w:jc w:val="left"/>
-            </w:pPr>
-            <w:r>
-              <w:t xml:space="preserve">₦16.5M</w:t>
-            </w:r>
-          </w:p>
-        </w:tc>
-        <w:tc>
-          <w:tcPr/>
-          <w:p>
-            <w:pPr>
-              <w:pStyle w:val="Compact"/>
-              <w:jc w:val="left"/>
-            </w:pPr>
-            <w:r>
-              <w:t xml:space="preserve">₦91.5M</w:t>
-            </w:r>
-          </w:p>
-        </w:tc>
-        <w:tc>
-          <w:tcPr/>
-          <w:p>
-            <w:pPr>
-              <w:pStyle w:val="Compact"/>
-              <w:jc w:val="left"/>
-            </w:pPr>
-            <w:r>
-              <w:t xml:space="preserve">₦1.5M</w:t>
-            </w:r>
-          </w:p>
-        </w:tc>
-      </w:tr>
-      <w:tr>
-        <w:tc>
-          <w:tcPr/>
-          <w:p>
-            <w:pPr>
-              <w:pStyle w:val="Compact"/>
-              <w:jc w:val="left"/>
-            </w:pPr>
-            <w:r>
-              <w:t xml:space="preserve">Q3</w:t>
-            </w:r>
-          </w:p>
-        </w:tc>
-        <w:tc>
-          <w:tcPr/>
-          <w:p>
-            <w:pPr>
-              <w:pStyle w:val="Compact"/>
-              <w:jc w:val="left"/>
-            </w:pPr>
-            <w:r>
-              <w:t xml:space="preserve">7–9</w:t>
-            </w:r>
-          </w:p>
-        </w:tc>
-        <w:tc>
-          <w:tcPr/>
-          <w:p>
-            <w:pPr>
-              <w:pStyle w:val="Compact"/>
-              <w:jc w:val="left"/>
-            </w:pPr>
-            <w:r>
-              <w:t xml:space="preserve">₦17.0M</w:t>
-            </w:r>
-          </w:p>
-        </w:tc>
-        <w:tc>
-          <w:tcPr/>
-          <w:p>
-            <w:pPr>
-              <w:pStyle w:val="Compact"/>
-              <w:jc w:val="left"/>
-            </w:pPr>
-            <w:r>
-              <w:t xml:space="preserve">₦142.5M</w:t>
-            </w:r>
-          </w:p>
-        </w:tc>
-        <w:tc>
-          <w:tcPr/>
-          <w:p>
-            <w:pPr>
-              <w:pStyle w:val="Compact"/>
-              <w:jc w:val="left"/>
-            </w:pPr>
-            <w:r>
-              <w:t xml:space="preserve">₦8.0M</w:t>
-            </w:r>
-          </w:p>
-        </w:tc>
-      </w:tr>
-      <w:tr>
-        <w:tc>
-          <w:tcPr/>
-          <w:p>
-            <w:pPr>
-              <w:pStyle w:val="Compact"/>
-              <w:jc w:val="left"/>
-            </w:pPr>
-            <w:r>
-              <w:t xml:space="preserve">Q4</w:t>
-            </w:r>
-          </w:p>
-        </w:tc>
-        <w:tc>
-          <w:tcPr/>
-          <w:p>
-            <w:pPr>
-              <w:pStyle w:val="Compact"/>
-              <w:jc w:val="left"/>
-            </w:pPr>
-            <w:r>
-              <w:t xml:space="preserve">10–12</w:t>
-            </w:r>
-          </w:p>
-        </w:tc>
-        <w:tc>
-          <w:tcPr/>
-          <w:p>
-            <w:pPr>
-              <w:pStyle w:val="Compact"/>
-              <w:jc w:val="left"/>
-            </w:pPr>
-            <w:r>
-              <w:t xml:space="preserve">₦15.0M</w:t>
-            </w:r>
-          </w:p>
-        </w:tc>
-        <w:tc>
-          <w:tcPr/>
-          <w:p>
-            <w:pPr>
-              <w:pStyle w:val="Compact"/>
-              <w:jc w:val="left"/>
-            </w:pPr>
-            <w:r>
-              <w:t xml:space="preserve">₦187.5M</w:t>
-            </w:r>
-          </w:p>
-        </w:tc>
-        <w:tc>
-          <w:tcPr/>
-          <w:p>
-            <w:pPr>
-              <w:pStyle w:val="Compact"/>
-              <w:jc w:val="left"/>
-            </w:pPr>
-            <w:r>
-              <w:t xml:space="preserve">₦22.0M</w:t>
-            </w:r>
-          </w:p>
-        </w:tc>
-      </w:tr>
-      <w:tr>
-        <w:tc>
-          <w:tcPr/>
-          <w:p>
-            <w:pPr>
-              <w:pStyle w:val="Compact"/>
-              <w:jc w:val="left"/>
-            </w:pPr>
-            <w:r>
-              <w:t xml:space="preserve">Q5</w:t>
-            </w:r>
-          </w:p>
-        </w:tc>
-        <w:tc>
-          <w:tcPr/>
-          <w:p>
-            <w:pPr>
-              <w:pStyle w:val="Compact"/>
-              <w:jc w:val="left"/>
-            </w:pPr>
-            <w:r>
-              <w:t xml:space="preserve">13–15</w:t>
-            </w:r>
-          </w:p>
-        </w:tc>
-        <w:tc>
-          <w:tcPr/>
-          <w:p>
-            <w:pPr>
-              <w:pStyle w:val="Compact"/>
-              <w:jc w:val="left"/>
-            </w:pPr>
-            <w:r>
-              <w:t xml:space="preserve">₦12.5M</w:t>
-            </w:r>
-          </w:p>
-        </w:tc>
-        <w:tc>
-          <w:tcPr/>
-          <w:p>
-            <w:pPr>
-              <w:pStyle w:val="Compact"/>
-              <w:jc w:val="left"/>
-            </w:pPr>
-            <w:r>
-              <w:t xml:space="preserve">₦225.0M</w:t>
-            </w:r>
-          </w:p>
-        </w:tc>
-        <w:tc>
-          <w:tcPr/>
-          <w:p>
-            <w:pPr>
-              <w:pStyle w:val="Compact"/>
-              <w:jc w:val="left"/>
-            </w:pPr>
-            <w:r>
-              <w:t xml:space="preserve">₦32.0M</w:t>
-            </w:r>
-          </w:p>
-        </w:tc>
-      </w:tr>
-      <w:tr>
-        <w:tc>
-          <w:tcPr/>
-          <w:p>
-            <w:pPr>
-              <w:pStyle w:val="Compact"/>
-              <w:jc w:val="left"/>
-            </w:pPr>
-            <w:r>
-              <w:t xml:space="preserve">Q6</w:t>
-            </w:r>
-          </w:p>
-        </w:tc>
-        <w:tc>
-          <w:tcPr/>
-          <w:p>
-            <w:pPr>
-              <w:pStyle w:val="Compact"/>
-              <w:jc w:val="left"/>
-            </w:pPr>
-            <w:r>
-              <w:t xml:space="preserve">16–18</w:t>
-            </w:r>
-          </w:p>
-        </w:tc>
-        <w:tc>
-          <w:tcPr/>
-          <w:p>
-            <w:pPr>
-              <w:pStyle w:val="Compact"/>
-              <w:jc w:val="left"/>
-            </w:pPr>
-            <w:r>
-              <w:t xml:space="preserve">₦8.3M</w:t>
-            </w:r>
-          </w:p>
-        </w:tc>
-        <w:tc>
-          <w:tcPr/>
-          <w:p>
-            <w:pPr>
-              <w:pStyle w:val="Compact"/>
-              <w:jc w:val="left"/>
-            </w:pPr>
-            <w:r>
-              <w:t xml:space="preserve">₦250.0M</w:t>
-            </w:r>
-          </w:p>
-        </w:tc>
-        <w:tc>
-          <w:tcPr/>
-          <w:p>
-            <w:pPr>
-              <w:pStyle w:val="Compact"/>
-              <w:jc w:val="left"/>
-            </w:pPr>
-            <w:r>
-              <w:t xml:space="preserve">₦42.0M</w:t>
+              <w:t xml:space="preserve">9</w:t>
+            </w:r>
+          </w:p>
+        </w:tc>
+        <w:tc>
+          <w:tcPr/>
+          <w:p>
+            <w:pPr>
+              <w:pStyle w:val="Compact"/>
+              <w:jc w:val="left"/>
+            </w:pPr>
+            <w:r>
+              <w:t xml:space="preserve">18</w:t>
+            </w:r>
+          </w:p>
+        </w:tc>
+        <w:tc>
+          <w:tcPr/>
+          <w:p>
+            <w:pPr>
+              <w:pStyle w:val="Compact"/>
+              <w:jc w:val="left"/>
+            </w:pPr>
+            <w:r>
+              <w:t xml:space="preserve">22–25</w:t>
             </w:r>
           </w:p>
         </w:tc>
@@ -2030,7 +2069,7 @@
         <w:t xml:space="preserve"> </w:t>
       </w:r>
       <w:r>
-        <w:t xml:space="preserve">₦103.6M</w:t>
+        <w:t xml:space="preserve">₦103.6M |</w:t>
       </w:r>
       <w:r>
         <w:t xml:space="preserve"> </w:t>
@@ -2040,13 +2079,13 @@
           <w:bCs/>
           <w:b/>
         </w:rPr>
-        <w:t xml:space="preserve">Break-even projected:</w:t>
+        <w:t xml:space="preserve">Break-even:</w:t>
       </w:r>
       <w:r>
         <w:t xml:space="preserve"> </w:t>
       </w:r>
       <w:r>
-        <w:t xml:space="preserve">Month 14–16 (operational break-even)</w:t>
+        <w:t xml:space="preserve">Month 14–16</w:t>
       </w:r>
     </w:p>
     <w:p>
@@ -2056,14 +2095,14 @@
         </w:pict>
       </w:r>
     </w:p>
-    <w:bookmarkEnd w:id="26"/>
-    <w:bookmarkStart w:id="27" w:name="team-growth"/>
+    <w:bookmarkEnd w:id="27"/>
+    <w:bookmarkStart w:id="28" w:name="team-growth-lean"/>
     <w:p>
       <w:pPr>
         <w:pStyle w:val="Heading2"/>
       </w:pPr>
       <w:r>
-        <w:t xml:space="preserve">Team Growth</w:t>
+        <w:t xml:space="preserve">Team Growth (Lean)</w:t>
       </w:r>
     </w:p>
     <w:tbl>
@@ -2153,31 +2192,31 @@
               <w:jc w:val="left"/>
             </w:pPr>
             <w:r>
-              <w:t xml:space="preserve">7</w:t>
-            </w:r>
-          </w:p>
-        </w:tc>
-        <w:tc>
-          <w:tcPr/>
-          <w:p>
-            <w:pPr>
-              <w:pStyle w:val="Compact"/>
-              <w:jc w:val="left"/>
-            </w:pPr>
-            <w:r>
-              <w:t xml:space="preserve">₦2,400,000</w:t>
-            </w:r>
-          </w:p>
-        </w:tc>
-        <w:tc>
-          <w:tcPr/>
-          <w:p>
-            <w:pPr>
-              <w:pStyle w:val="Compact"/>
-              <w:jc w:val="left"/>
-            </w:pPr>
-            <w:r>
-              <w:t xml:space="preserve">CTO, 2 engineers, UI/UX, compliance, market ops</w:t>
+              <w:t xml:space="preserve">5</w:t>
+            </w:r>
+          </w:p>
+        </w:tc>
+        <w:tc>
+          <w:tcPr/>
+          <w:p>
+            <w:pPr>
+              <w:pStyle w:val="Compact"/>
+              <w:jc w:val="left"/>
+            </w:pPr>
+            <w:r>
+              <w:t xml:space="preserve">₦1,950,000</w:t>
+            </w:r>
+          </w:p>
+        </w:tc>
+        <w:tc>
+          <w:tcPr/>
+          <w:p>
+            <w:pPr>
+              <w:pStyle w:val="Compact"/>
+              <w:jc w:val="left"/>
+            </w:pPr>
+            <w:r>
+              <w:t xml:space="preserve">CTO, 2 engineers, market ops</w:t>
             </w:r>
           </w:p>
         </w:tc>
@@ -2203,31 +2242,31 @@
               <w:jc w:val="left"/>
             </w:pPr>
             <w:r>
-              <w:t xml:space="preserve">12</w:t>
-            </w:r>
-          </w:p>
-        </w:tc>
-        <w:tc>
-          <w:tcPr/>
-          <w:p>
-            <w:pPr>
-              <w:pStyle w:val="Compact"/>
-              <w:jc w:val="left"/>
-            </w:pPr>
-            <w:r>
-              <w:t xml:space="preserve">₦3,990,000</w:t>
-            </w:r>
-          </w:p>
-        </w:tc>
-        <w:tc>
-          <w:tcPr/>
-          <w:p>
-            <w:pPr>
-              <w:pStyle w:val="Compact"/>
-              <w:jc w:val="left"/>
-            </w:pPr>
-            <w:r>
-              <w:t xml:space="preserve">IoT engineer, DevOps, 3 field agents</w:t>
+              <w:t xml:space="preserve">9</w:t>
+            </w:r>
+          </w:p>
+        </w:tc>
+        <w:tc>
+          <w:tcPr/>
+          <w:p>
+            <w:pPr>
+              <w:pStyle w:val="Compact"/>
+              <w:jc w:val="left"/>
+            </w:pPr>
+            <w:r>
+              <w:t xml:space="preserve">₦3,060,000</w:t>
+            </w:r>
+          </w:p>
+        </w:tc>
+        <w:tc>
+          <w:tcPr/>
+          <w:p>
+            <w:pPr>
+              <w:pStyle w:val="Compact"/>
+              <w:jc w:val="left"/>
+            </w:pPr>
+            <w:r>
+              <w:t xml:space="preserve">IoT engineer, DevOps, 2 agents</w:t>
             </w:r>
           </w:p>
         </w:tc>
@@ -2253,6 +2292,56 @@
               <w:jc w:val="left"/>
             </w:pPr>
             <w:r>
+              <w:t xml:space="preserve">13</w:t>
+            </w:r>
+          </w:p>
+        </w:tc>
+        <w:tc>
+          <w:tcPr/>
+          <w:p>
+            <w:pPr>
+              <w:pStyle w:val="Compact"/>
+              <w:jc w:val="left"/>
+            </w:pPr>
+            <w:r>
+              <w:t xml:space="preserve">₦4,310,000</w:t>
+            </w:r>
+          </w:p>
+        </w:tc>
+        <w:tc>
+          <w:tcPr/>
+          <w:p>
+            <w:pPr>
+              <w:pStyle w:val="Compact"/>
+              <w:jc w:val="left"/>
+            </w:pPr>
+            <w:r>
+              <w:t xml:space="preserve">Payments PM, data analyst, 2 support</w:t>
+            </w:r>
+          </w:p>
+        </w:tc>
+      </w:tr>
+      <w:tr>
+        <w:tc>
+          <w:tcPr/>
+          <w:p>
+            <w:pPr>
+              <w:pStyle w:val="Compact"/>
+              <w:jc w:val="left"/>
+            </w:pPr>
+            <w:r>
+              <w:t xml:space="preserve">Phase 4 (Mo 10–12)</w:t>
+            </w:r>
+          </w:p>
+        </w:tc>
+        <w:tc>
+          <w:tcPr/>
+          <w:p>
+            <w:pPr>
+              <w:pStyle w:val="Compact"/>
+              <w:jc w:val="left"/>
+            </w:pPr>
+            <w:r>
               <w:t xml:space="preserve">18</w:t>
             </w:r>
           </w:p>
@@ -2265,69 +2354,19 @@
               <w:jc w:val="left"/>
             </w:pPr>
             <w:r>
-              <w:t xml:space="preserve">₦5,890,000</w:t>
-            </w:r>
-          </w:p>
-        </w:tc>
-        <w:tc>
-          <w:tcPr/>
-          <w:p>
-            <w:pPr>
-              <w:pStyle w:val="Compact"/>
-              <w:jc w:val="left"/>
-            </w:pPr>
-            <w:r>
-              <w:t xml:space="preserve">Payments PM, data analyst, 3 support, 5 agents</w:t>
-            </w:r>
-          </w:p>
-        </w:tc>
-      </w:tr>
-      <w:tr>
-        <w:tc>
-          <w:tcPr/>
-          <w:p>
-            <w:pPr>
-              <w:pStyle w:val="Compact"/>
-              <w:jc w:val="left"/>
-            </w:pPr>
-            <w:r>
-              <w:t xml:space="preserve">Phase 4 (Mo 10–12)</w:t>
-            </w:r>
-          </w:p>
-        </w:tc>
-        <w:tc>
-          <w:tcPr/>
-          <w:p>
-            <w:pPr>
-              <w:pStyle w:val="Compact"/>
-              <w:jc w:val="left"/>
-            </w:pPr>
-            <w:r>
-              <w:t xml:space="preserve">25</w:t>
-            </w:r>
-          </w:p>
-        </w:tc>
-        <w:tc>
-          <w:tcPr/>
-          <w:p>
-            <w:pPr>
-              <w:pStyle w:val="Compact"/>
-              <w:jc w:val="left"/>
-            </w:pPr>
-            <w:r>
-              <w:t xml:space="preserve">₦7,840,000</w:t>
-            </w:r>
-          </w:p>
-        </w:tc>
-        <w:tc>
-          <w:tcPr/>
-          <w:p>
-            <w:pPr>
-              <w:pStyle w:val="Compact"/>
-              <w:jc w:val="left"/>
-            </w:pPr>
-            <w:r>
-              <w:t xml:space="preserve">Risk analyst, logistics lead, 3 jr engineers</w:t>
+              <w:t xml:space="preserve">₦5,320,000</w:t>
+            </w:r>
+          </w:p>
+        </w:tc>
+        <w:tc>
+          <w:tcPr/>
+          <w:p>
+            <w:pPr>
+              <w:pStyle w:val="Compact"/>
+              <w:jc w:val="left"/>
+            </w:pPr>
+            <w:r>
+              <w:t xml:space="preserve">Logistics lead, 2 jr engineers, 2 agents</w:t>
             </w:r>
           </w:p>
         </w:tc>
@@ -2353,50 +2392,36 @@
               <w:jc w:val="left"/>
             </w:pPr>
             <w:r>
-              <w:t xml:space="preserve">30–35</w:t>
-            </w:r>
-          </w:p>
-        </w:tc>
-        <w:tc>
-          <w:tcPr/>
-          <w:p>
-            <w:pPr>
-              <w:pStyle w:val="Compact"/>
-              <w:jc w:val="left"/>
-            </w:pPr>
-            <w:r>
-              <w:t xml:space="preserve">₦9,390,000</w:t>
-            </w:r>
-          </w:p>
-        </w:tc>
-        <w:tc>
-          <w:tcPr/>
-          <w:p>
-            <w:pPr>
-              <w:pStyle w:val="Compact"/>
-              <w:jc w:val="left"/>
-            </w:pPr>
-            <w:r>
-              <w:t xml:space="preserve">Data engineer, BD lead, regional coordinators</w:t>
+              <w:t xml:space="preserve">22–25</w:t>
+            </w:r>
+          </w:p>
+        </w:tc>
+        <w:tc>
+          <w:tcPr/>
+          <w:p>
+            <w:pPr>
+              <w:pStyle w:val="Compact"/>
+              <w:jc w:val="left"/>
+            </w:pPr>
+            <w:r>
+              <w:t xml:space="preserve">₦6,690,000</w:t>
+            </w:r>
+          </w:p>
+        </w:tc>
+        <w:tc>
+          <w:tcPr/>
+          <w:p>
+            <w:pPr>
+              <w:pStyle w:val="Compact"/>
+              <w:jc w:val="left"/>
+            </w:pPr>
+            <w:r>
+              <w:t xml:space="preserve">Data engineer, BD lead, field coordinator</w:t>
             </w:r>
           </w:p>
         </w:tc>
       </w:tr>
     </w:tbl>
-    <w:p>
-      <w:pPr>
-        <w:pStyle w:val="BlockText"/>
-      </w:pPr>
-      <w:r>
-        <w:t xml:space="preserve">Salaries benchmarked against Glassdoor, PayScale, and Levels.fyi Nigeria data (March 2026).</w:t>
-      </w:r>
-      <w:r>
-        <w:t xml:space="preserve"> </w:t>
-      </w:r>
-      <w:r>
-        <w:t xml:space="preserve">All figures are for on-site/local roles in Lagos. Lean/startup-tier compensation offset by equity for key hires.</w:t>
-      </w:r>
-    </w:p>
     <w:p>
       <w:r>
         <w:pict>
@@ -2404,79 +2429,14 @@
         </w:pict>
       </w:r>
     </w:p>
-    <w:bookmarkEnd w:id="27"/>
-    <w:bookmarkStart w:id="28" w:name="psspptsp-payment-license-critical-note"/>
+    <w:bookmarkEnd w:id="28"/>
+    <w:bookmarkStart w:id="29" w:name="psspptsp-payment-licenses-funding-gap"/>
     <w:p>
       <w:pPr>
         <w:pStyle w:val="Heading2"/>
       </w:pPr>
       <w:r>
-        <w:t xml:space="preserve">PSSP/PTSP Payment License — Critical Note</w:t>
-      </w:r>
-    </w:p>
-    <w:p>
-      <w:pPr>
-        <w:pStyle w:val="FirstParagraph"/>
-      </w:pPr>
-      <w:r>
-        <w:t xml:space="preserve">The CBN requires</w:t>
-      </w:r>
-      <w:r>
-        <w:t xml:space="preserve"> </w:t>
-      </w:r>
-      <w:r>
-        <w:rPr>
-          <w:bCs/>
-          <w:b/>
-        </w:rPr>
-        <w:t xml:space="preserve">₦100M minimum share capital</w:t>
-      </w:r>
-      <w:r>
-        <w:t xml:space="preserve"> </w:t>
-      </w:r>
-      <w:r>
-        <w:t xml:space="preserve">+</w:t>
-      </w:r>
-      <w:r>
-        <w:t xml:space="preserve"> </w:t>
-      </w:r>
-      <w:r>
-        <w:rPr>
-          <w:bCs/>
-          <w:b/>
-        </w:rPr>
-        <w:t xml:space="preserve">₦100M refundable escrow</w:t>
-      </w:r>
-      <w:r>
-        <w:t xml:space="preserve"> </w:t>
-      </w:r>
-      <w:r>
-        <w:t xml:space="preserve">for PSSP licensing — totaling</w:t>
-      </w:r>
-      <w:r>
-        <w:t xml:space="preserve"> </w:t>
-      </w:r>
-      <w:r>
-        <w:rPr>
-          <w:bCs/>
-          <w:b/>
-        </w:rPr>
-        <w:t xml:space="preserve">₦200M</w:t>
-      </w:r>
-      <w:r>
-        <w:t xml:space="preserve">, which exceeds this raise.</w:t>
-      </w:r>
-    </w:p>
-    <w:p>
-      <w:pPr>
-        <w:pStyle w:val="BodyText"/>
-      </w:pPr>
-      <w:r>
-        <w:rPr>
-          <w:bCs/>
-          <w:b/>
-        </w:rPr>
-        <w:t xml:space="preserve">Our Strategy (Dual-Path):</w:t>
+        <w:t xml:space="preserve">PSSP/PTSP Payment Licenses — Funding Gap</w:t>
       </w:r>
     </w:p>
     <w:tbl>
@@ -2487,9 +2447,10 @@
         <w:jc w:val="start"/>
       </w:tblPr>
       <w:tblGrid>
-        <w:gridCol w:w="1827"/>
-        <w:gridCol w:w="3046"/>
-        <w:gridCol w:w="3046"/>
+        <w:gridCol w:w="1320"/>
+        <w:gridCol w:w="2493"/>
+        <w:gridCol w:w="2346"/>
+        <w:gridCol w:w="1760"/>
       </w:tblGrid>
       <w:tr>
         <w:trPr>
@@ -2503,31 +2464,43 @@
               <w:jc w:val="left"/>
             </w:pPr>
             <w:r>
-              <w:t xml:space="preserve">Path</w:t>
-            </w:r>
-          </w:p>
-        </w:tc>
-        <w:tc>
-          <w:tcPr/>
-          <w:p>
-            <w:pPr>
-              <w:pStyle w:val="Compact"/>
-              <w:jc w:val="left"/>
-            </w:pPr>
-            <w:r>
-              <w:t xml:space="preserve">Approach</w:t>
-            </w:r>
-          </w:p>
-        </w:tc>
-        <w:tc>
-          <w:tcPr/>
-          <w:p>
-            <w:pPr>
-              <w:pStyle w:val="Compact"/>
-              <w:jc w:val="left"/>
-            </w:pPr>
-            <w:r>
-              <w:t xml:space="preserve">Timeline</w:t>
+              <w:t xml:space="preserve">License</w:t>
+            </w:r>
+          </w:p>
+        </w:tc>
+        <w:tc>
+          <w:tcPr/>
+          <w:p>
+            <w:pPr>
+              <w:pStyle w:val="Compact"/>
+              <w:jc w:val="left"/>
+            </w:pPr>
+            <w:r>
+              <w:t xml:space="preserve">Capital Required</w:t>
+            </w:r>
+          </w:p>
+        </w:tc>
+        <w:tc>
+          <w:tcPr/>
+          <w:p>
+            <w:pPr>
+              <w:pStyle w:val="Compact"/>
+              <w:jc w:val="left"/>
+            </w:pPr>
+            <w:r>
+              <w:t xml:space="preserve">Escrow Duration</w:t>
+            </w:r>
+          </w:p>
+        </w:tc>
+        <w:tc>
+          <w:tcPr/>
+          <w:p>
+            <w:pPr>
+              <w:pStyle w:val="Compact"/>
+              <w:jc w:val="left"/>
+            </w:pPr>
+            <w:r>
+              <w:t xml:space="preserve">From ₦250M?</w:t>
             </w:r>
           </w:p>
         </w:tc>
@@ -2545,36 +2518,28 @@
                 <w:bCs/>
                 <w:b/>
               </w:rPr>
-              <w:t xml:space="preserve">Path A (Primary)</w:t>
-            </w:r>
-          </w:p>
-        </w:tc>
-        <w:tc>
-          <w:tcPr/>
-          <w:p>
-            <w:pPr>
-              <w:pStyle w:val="Compact"/>
-              <w:jc w:val="left"/>
-            </w:pPr>
-            <w:r>
-              <w:t xml:space="preserve">Apply for PSSP license in Month 9. Fund from investor’s next capital injection as business gains traction</w:t>
-            </w:r>
-          </w:p>
-        </w:tc>
-        <w:tc>
-          <w:tcPr/>
-          <w:p>
-            <w:pPr>
-              <w:pStyle w:val="Compact"/>
-              <w:jc w:val="left"/>
-            </w:pPr>
-            <w:r>
-              <w:t xml:space="preserve">Month 9–18</w:t>
-            </w:r>
-          </w:p>
-        </w:tc>
-      </w:tr>
-      <w:tr>
+              <w:t xml:space="preserve">PSSP</w:t>
+            </w:r>
+            <w:r>
+              <w:t xml:space="preserve"> </w:t>
+            </w:r>
+            <w:r>
+              <w:t xml:space="preserve">(Payments)</w:t>
+            </w:r>
+          </w:p>
+        </w:tc>
+        <w:tc>
+          <w:tcPr/>
+          <w:p>
+            <w:pPr>
+              <w:pStyle w:val="Compact"/>
+              <w:jc w:val="left"/>
+            </w:pPr>
+            <w:r>
+              <w:t xml:space="preserve">~₦205M (₦100M capital + ₦100M escrow + fees)</w:t>
+            </w:r>
+          </w:p>
+        </w:tc>
         <w:tc>
           <w:tcPr/>
           <w:p>
@@ -2587,31 +2552,103 @@
                 <w:bCs/>
                 <w:b/>
               </w:rPr>
-              <w:t xml:space="preserve">Path B (Fallback)</w:t>
-            </w:r>
-          </w:p>
-        </w:tc>
-        <w:tc>
-          <w:tcPr/>
-          <w:p>
-            <w:pPr>
-              <w:pStyle w:val="Compact"/>
-              <w:jc w:val="left"/>
-            </w:pPr>
-            <w:r>
-              <w:t xml:space="preserve">Partner with Paystack/Flutterwave for payment processing. Defer own license until capital is available</w:t>
-            </w:r>
-          </w:p>
-        </w:tc>
-        <w:tc>
-          <w:tcPr/>
-          <w:p>
-            <w:pPr>
-              <w:pStyle w:val="Compact"/>
-              <w:jc w:val="left"/>
-            </w:pPr>
-            <w:r>
-              <w:t xml:space="preserve">Immediate</w:t>
+              <w:t xml:space="preserve">Life of license</w:t>
+            </w:r>
+            <w:r>
+              <w:t xml:space="preserve"> </w:t>
+            </w:r>
+            <w:r>
+              <w:t xml:space="preserve">(refundable on surrender)</w:t>
+            </w:r>
+          </w:p>
+        </w:tc>
+        <w:tc>
+          <w:tcPr/>
+          <w:p>
+            <w:pPr>
+              <w:pStyle w:val="Compact"/>
+              <w:jc w:val="left"/>
+            </w:pPr>
+            <w:r>
+              <w:rPr>
+                <w:bCs/>
+                <w:b/>
+              </w:rPr>
+              <w:t xml:space="preserve">No — Next tranche</w:t>
+            </w:r>
+          </w:p>
+        </w:tc>
+      </w:tr>
+      <w:tr>
+        <w:tc>
+          <w:tcPr/>
+          <w:p>
+            <w:pPr>
+              <w:pStyle w:val="Compact"/>
+              <w:jc w:val="left"/>
+            </w:pPr>
+            <w:r>
+              <w:rPr>
+                <w:bCs/>
+                <w:b/>
+              </w:rPr>
+              <w:t xml:space="preserve">PTSP</w:t>
+            </w:r>
+            <w:r>
+              <w:t xml:space="preserve"> </w:t>
+            </w:r>
+            <w:r>
+              <w:t xml:space="preserve">(POS Terminals)</w:t>
+            </w:r>
+          </w:p>
+        </w:tc>
+        <w:tc>
+          <w:tcPr/>
+          <w:p>
+            <w:pPr>
+              <w:pStyle w:val="Compact"/>
+              <w:jc w:val="left"/>
+            </w:pPr>
+            <w:r>
+              <w:t xml:space="preserve">~₦201M (₦100M capital + ₦100M escrow + fees)</w:t>
+            </w:r>
+          </w:p>
+        </w:tc>
+        <w:tc>
+          <w:tcPr/>
+          <w:p>
+            <w:pPr>
+              <w:pStyle w:val="Compact"/>
+              <w:jc w:val="left"/>
+            </w:pPr>
+            <w:r>
+              <w:rPr>
+                <w:bCs/>
+                <w:b/>
+              </w:rPr>
+              <w:t xml:space="preserve">Life of license</w:t>
+            </w:r>
+            <w:r>
+              <w:t xml:space="preserve"> </w:t>
+            </w:r>
+            <w:r>
+              <w:t xml:space="preserve">(refundable on surrender)</w:t>
+            </w:r>
+          </w:p>
+        </w:tc>
+        <w:tc>
+          <w:tcPr/>
+          <w:p>
+            <w:pPr>
+              <w:pStyle w:val="Compact"/>
+              <w:jc w:val="left"/>
+            </w:pPr>
+            <w:r>
+              <w:rPr>
+                <w:bCs/>
+                <w:b/>
+              </w:rPr>
+              <w:t xml:space="preserve">No — Next tranche</w:t>
             </w:r>
           </w:p>
         </w:tc>
@@ -2622,7 +2659,77 @@
         <w:pStyle w:val="BodyText"/>
       </w:pPr>
       <w:r>
-        <w:t xml:space="preserve">Payment processing revenue is protected either way — Path A gives higher margins (own processing), Path B gives faster time-to-market with zero regulatory risk. The investor has committed to additional injections as the business performs.</w:t>
+        <w:rPr>
+          <w:bCs/>
+          <w:b/>
+        </w:rPr>
+        <w:t xml:space="preserve">Strategy:</w:t>
+      </w:r>
+      <w:r>
+        <w:t xml:space="preserve"> </w:t>
+      </w:r>
+      <w:r>
+        <w:t xml:space="preserve">-</w:t>
+      </w:r>
+      <w:r>
+        <w:t xml:space="preserve"> </w:t>
+      </w:r>
+      <w:r>
+        <w:rPr>
+          <w:bCs/>
+          <w:b/>
+        </w:rPr>
+        <w:t xml:space="preserve">Phase 1–3:</w:t>
+      </w:r>
+      <w:r>
+        <w:t xml:space="preserve"> </w:t>
+      </w:r>
+      <w:r>
+        <w:t xml:space="preserve">Partner with Paystack/Flutterwave (zero license cost)</w:t>
+      </w:r>
+      <w:r>
+        <w:t xml:space="preserve"> </w:t>
+      </w:r>
+      <w:r>
+        <w:t xml:space="preserve">-</w:t>
+      </w:r>
+      <w:r>
+        <w:t xml:space="preserve"> </w:t>
+      </w:r>
+      <w:r>
+        <w:rPr>
+          <w:bCs/>
+          <w:b/>
+        </w:rPr>
+        <w:t xml:space="preserve">When business grows:</w:t>
+      </w:r>
+      <w:r>
+        <w:t xml:space="preserve"> </w:t>
+      </w:r>
+      <w:r>
+        <w:t xml:space="preserve">Investor injects capital for PSSP license</w:t>
+      </w:r>
+      <w:r>
+        <w:t xml:space="preserve"> </w:t>
+      </w:r>
+      <w:r>
+        <w:t xml:space="preserve">-</w:t>
+      </w:r>
+      <w:r>
+        <w:t xml:space="preserve"> </w:t>
+      </w:r>
+      <w:r>
+        <w:rPr>
+          <w:bCs/>
+          <w:b/>
+        </w:rPr>
+        <w:t xml:space="preserve">Post-18 months:</w:t>
+      </w:r>
+      <w:r>
+        <w:t xml:space="preserve"> </w:t>
+      </w:r>
+      <w:r>
+        <w:t xml:space="preserve">PTSP license for own POS terminal deployment</w:t>
       </w:r>
     </w:p>
     <w:p>
@@ -2632,8 +2739,8 @@
         </w:pict>
       </w:r>
     </w:p>
-    <w:bookmarkEnd w:id="28"/>
-    <w:bookmarkStart w:id="29" w:name="equity-structure"/>
+    <w:bookmarkEnd w:id="29"/>
+    <w:bookmarkStart w:id="30" w:name="equity-structure"/>
     <w:p>
       <w:pPr>
         <w:pStyle w:val="Heading2"/>
@@ -2766,7 +2873,7 @@
               <w:jc w:val="left"/>
             </w:pPr>
             <w:r>
-              <w:t xml:space="preserve">CTO, Payments PM, key hires (4-year vesting)</w:t>
+              <w:t xml:space="preserve">CTO, key hires (4-year vesting)</w:t>
             </w:r>
           </w:p>
         </w:tc>
@@ -2804,7 +2911,7 @@
               <w:jc w:val="left"/>
             </w:pPr>
             <w:r>
-              <w:t xml:space="preserve">This round (₦250M valuation basis)</w:t>
+              <w:t xml:space="preserve">This round</w:t>
             </w:r>
           </w:p>
         </w:tc>
@@ -2848,24 +2955,6 @@
         </w:tc>
       </w:tr>
     </w:tbl>
-    <w:p>
-      <w:pPr>
-        <w:pStyle w:val="BodyText"/>
-      </w:pPr>
-      <w:r>
-        <w:rPr>
-          <w:bCs/>
-          <w:b/>
-        </w:rPr>
-        <w:t xml:space="preserve">Investor Protections:</w:t>
-      </w:r>
-      <w:r>
-        <w:t xml:space="preserve"> </w:t>
-      </w:r>
-      <w:r>
-        <w:t xml:space="preserve">Monthly financial reporting, optional board seat, quarterly milestone reviews, anti-dilution provisions, right of first refusal on Series A.</w:t>
-      </w:r>
-    </w:p>
     <w:p>
       <w:r>
         <w:pict>
@@ -2873,8 +2962,8 @@
         </w:pict>
       </w:r>
     </w:p>
-    <w:bookmarkEnd w:id="29"/>
-    <w:bookmarkStart w:id="30" w:name="competitive-edge"/>
+    <w:bookmarkEnd w:id="30"/>
+    <w:bookmarkStart w:id="31" w:name="competitive-edge"/>
     <w:p>
       <w:pPr>
         <w:pStyle w:val="Heading2"/>
@@ -2948,7 +3037,7 @@
               <w:jc w:val="left"/>
             </w:pPr>
             <w:r>
-              <w:t xml:space="preserve">Free ERP creates daily dependency; hardware deepens it</w:t>
+              <w:t xml:space="preserve">Free ERP + hardware creates daily dependency</w:t>
             </w:r>
           </w:p>
         </w:tc>
@@ -2966,19 +3055,49 @@
                 <w:bCs/>
                 <w:b/>
               </w:rPr>
-              <w:t xml:space="preserve">African-Optimized</w:t>
-            </w:r>
-          </w:p>
-        </w:tc>
-        <w:tc>
-          <w:tcPr/>
-          <w:p>
-            <w:pPr>
-              <w:pStyle w:val="Compact"/>
-              <w:jc w:val="left"/>
-            </w:pPr>
-            <w:r>
-              <w:t xml:space="preserve">Offline-first, power-resilient, multi-network design</w:t>
+              <w:t xml:space="preserve">Designed for Africa</w:t>
+            </w:r>
+          </w:p>
+        </w:tc>
+        <w:tc>
+          <w:tcPr/>
+          <w:p>
+            <w:pPr>
+              <w:pStyle w:val="Compact"/>
+              <w:jc w:val="left"/>
+            </w:pPr>
+            <w:r>
+              <w:t xml:space="preserve">140–280V tolerance, offline-first, heat/dust resistant</w:t>
+            </w:r>
+          </w:p>
+        </w:tc>
+      </w:tr>
+      <w:tr>
+        <w:tc>
+          <w:tcPr/>
+          <w:p>
+            <w:pPr>
+              <w:pStyle w:val="Compact"/>
+              <w:jc w:val="left"/>
+            </w:pPr>
+            <w:r>
+              <w:rPr>
+                <w:bCs/>
+                <w:b/>
+              </w:rPr>
+              <w:t xml:space="preserve">Quality Promise</w:t>
+            </w:r>
+          </w:p>
+        </w:tc>
+        <w:tc>
+          <w:tcPr/>
+          <w:p>
+            <w:pPr>
+              <w:pStyle w:val="Compact"/>
+              <w:jc w:val="left"/>
+            </w:pPr>
+            <w:r>
+              <w:t xml:space="preserve">Reliability + good price for money — no bad products</w:t>
             </w:r>
           </w:p>
         </w:tc>
@@ -3038,7 +3157,7 @@
               <w:jc w:val="left"/>
             </w:pPr>
             <w:r>
-              <w:t xml:space="preserve">Founder directly sources hardware from China (Shenzhen)</w:t>
+              <w:t xml:space="preserve">Direct China sourcing (Shenzhen)</w:t>
             </w:r>
           </w:p>
         </w:tc>
@@ -3056,303 +3175,19 @@
                 <w:bCs/>
                 <w:b/>
               </w:rPr>
-              <w:t xml:space="preserve">No Single-Point Competition</w:t>
-            </w:r>
-          </w:p>
-        </w:tc>
-        <w:tc>
-          <w:tcPr/>
-          <w:p>
-            <w:pPr>
-              <w:pStyle w:val="Compact"/>
-              <w:jc w:val="left"/>
-            </w:pPr>
-            <w:r>
-              <w:t xml:space="preserve">No African company combines all 6 layers</w:t>
-            </w:r>
-          </w:p>
-        </w:tc>
-      </w:tr>
-    </w:tbl>
-    <w:p>
-      <w:r>
-        <w:pict>
-          <v:rect style="width:0;height:1.5pt" o:hralign="center" o:hrstd="t" o:hr="t"/>
-        </w:pict>
-      </w:r>
-    </w:p>
-    <w:bookmarkEnd w:id="30"/>
-    <w:bookmarkStart w:id="31" w:name="year-vision"/>
-    <w:p>
-      <w:pPr>
-        <w:pStyle w:val="Heading2"/>
-      </w:pPr>
-      <w:r>
-        <w:t xml:space="preserve">15-Year Vision</w:t>
-      </w:r>
-    </w:p>
-    <w:tbl>
-      <w:tblPr>
-        <w:tblStyle w:val="Table"/>
-        <w:tblW w:type="pct" w:w="5000"/>
-        <w:tblLook w:firstRow="1" w:lastRow="0" w:firstColumn="0" w:lastColumn="0" w:noHBand="0" w:noVBand="0" w:val="0020"/>
-        <w:jc w:val="start"/>
-      </w:tblPr>
-      <w:tblGrid>
-        <w:gridCol w:w="1498"/>
-        <w:gridCol w:w="1498"/>
-        <w:gridCol w:w="1498"/>
-        <w:gridCol w:w="3424"/>
-      </w:tblGrid>
-      <w:tr>
-        <w:trPr>
-          <w:tblHeader w:val="true"/>
-        </w:trPr>
-        <w:tc>
-          <w:tcPr/>
-          <w:p>
-            <w:pPr>
-              <w:pStyle w:val="Compact"/>
-              <w:jc w:val="left"/>
-            </w:pPr>
-            <w:r>
-              <w:t xml:space="preserve">Phase</w:t>
-            </w:r>
-          </w:p>
-        </w:tc>
-        <w:tc>
-          <w:tcPr/>
-          <w:p>
-            <w:pPr>
-              <w:pStyle w:val="Compact"/>
-              <w:jc w:val="left"/>
-            </w:pPr>
-            <w:r>
-              <w:t xml:space="preserve">Years</w:t>
-            </w:r>
-          </w:p>
-        </w:tc>
-        <w:tc>
-          <w:tcPr/>
-          <w:p>
-            <w:pPr>
-              <w:pStyle w:val="Compact"/>
-              <w:jc w:val="left"/>
-            </w:pPr>
-            <w:r>
-              <w:t xml:space="preserve">Scope</w:t>
-            </w:r>
-          </w:p>
-        </w:tc>
-        <w:tc>
-          <w:tcPr/>
-          <w:p>
-            <w:pPr>
-              <w:pStyle w:val="Compact"/>
-              <w:jc w:val="left"/>
-            </w:pPr>
-            <w:r>
-              <w:t xml:space="preserve">Revenue Target</w:t>
-            </w:r>
-          </w:p>
-        </w:tc>
-      </w:tr>
-      <w:tr>
-        <w:tc>
-          <w:tcPr/>
-          <w:p>
-            <w:pPr>
-              <w:pStyle w:val="Compact"/>
-              <w:jc w:val="left"/>
-            </w:pPr>
-            <w:r>
-              <w:t xml:space="preserve">Foundation</w:t>
-            </w:r>
-          </w:p>
-        </w:tc>
-        <w:tc>
-          <w:tcPr/>
-          <w:p>
-            <w:pPr>
-              <w:pStyle w:val="Compact"/>
-              <w:jc w:val="left"/>
-            </w:pPr>
-            <w:r>
-              <w:t xml:space="preserve">1–3</w:t>
-            </w:r>
-          </w:p>
-        </w:tc>
-        <w:tc>
-          <w:tcPr/>
-          <w:p>
-            <w:pPr>
-              <w:pStyle w:val="Compact"/>
-              <w:jc w:val="left"/>
-            </w:pPr>
-            <w:r>
-              <w:t xml:space="preserve">Nigeria (Lagos, Abuja, Aba, Kano)</w:t>
-            </w:r>
-          </w:p>
-        </w:tc>
-        <w:tc>
-          <w:tcPr/>
-          <w:p>
-            <w:pPr>
-              <w:pStyle w:val="Compact"/>
-              <w:jc w:val="left"/>
-            </w:pPr>
-            <w:r>
-              <w:t xml:space="preserve">₦1.5B+</w:t>
-            </w:r>
-          </w:p>
-        </w:tc>
-      </w:tr>
-      <w:tr>
-        <w:tc>
-          <w:tcPr/>
-          <w:p>
-            <w:pPr>
-              <w:pStyle w:val="Compact"/>
-              <w:jc w:val="left"/>
-            </w:pPr>
-            <w:r>
-              <w:t xml:space="preserve">West Africa</w:t>
-            </w:r>
-          </w:p>
-        </w:tc>
-        <w:tc>
-          <w:tcPr/>
-          <w:p>
-            <w:pPr>
-              <w:pStyle w:val="Compact"/>
-              <w:jc w:val="left"/>
-            </w:pPr>
-            <w:r>
-              <w:t xml:space="preserve">4–6</w:t>
-            </w:r>
-          </w:p>
-        </w:tc>
-        <w:tc>
-          <w:tcPr/>
-          <w:p>
-            <w:pPr>
-              <w:pStyle w:val="Compact"/>
-              <w:jc w:val="left"/>
-            </w:pPr>
-            <w:r>
-              <w:t xml:space="preserve">Ghana, Cote d’Ivoire, Kenya</w:t>
-            </w:r>
-          </w:p>
-        </w:tc>
-        <w:tc>
-          <w:tcPr/>
-          <w:p>
-            <w:pPr>
-              <w:pStyle w:val="Compact"/>
-              <w:jc w:val="left"/>
-            </w:pPr>
-            <w:r>
-              <w:t xml:space="preserve">₦4B+</w:t>
-            </w:r>
-          </w:p>
-        </w:tc>
-      </w:tr>
-      <w:tr>
-        <w:tc>
-          <w:tcPr/>
-          <w:p>
-            <w:pPr>
-              <w:pStyle w:val="Compact"/>
-              <w:jc w:val="left"/>
-            </w:pPr>
-            <w:r>
-              <w:t xml:space="preserve">Multi-Vertical Scale</w:t>
-            </w:r>
-          </w:p>
-        </w:tc>
-        <w:tc>
-          <w:tcPr/>
-          <w:p>
-            <w:pPr>
-              <w:pStyle w:val="Compact"/>
-              <w:jc w:val="left"/>
-            </w:pPr>
-            <w:r>
-              <w:t xml:space="preserve">7–10</w:t>
-            </w:r>
-          </w:p>
-        </w:tc>
-        <w:tc>
-          <w:tcPr/>
-          <w:p>
-            <w:pPr>
-              <w:pStyle w:val="Compact"/>
-              <w:jc w:val="left"/>
-            </w:pPr>
-            <w:r>
-              <w:t xml:space="preserve">8–10 countries, 16 verticals</w:t>
-            </w:r>
-          </w:p>
-        </w:tc>
-        <w:tc>
-          <w:tcPr/>
-          <w:p>
-            <w:pPr>
-              <w:pStyle w:val="Compact"/>
-              <w:jc w:val="left"/>
-            </w:pPr>
-            <w:r>
-              <w:t xml:space="preserve">₦15B+</w:t>
-            </w:r>
-          </w:p>
-        </w:tc>
-      </w:tr>
-      <w:tr>
-        <w:tc>
-          <w:tcPr/>
-          <w:p>
-            <w:pPr>
-              <w:pStyle w:val="Compact"/>
-              <w:jc w:val="left"/>
-            </w:pPr>
-            <w:r>
-              <w:t xml:space="preserve">Pan-African Infrastructure</w:t>
-            </w:r>
-          </w:p>
-        </w:tc>
-        <w:tc>
-          <w:tcPr/>
-          <w:p>
-            <w:pPr>
-              <w:pStyle w:val="Compact"/>
-              <w:jc w:val="left"/>
-            </w:pPr>
-            <w:r>
-              <w:t xml:space="preserve">11–15</w:t>
-            </w:r>
-          </w:p>
-        </w:tc>
-        <w:tc>
-          <w:tcPr/>
-          <w:p>
-            <w:pPr>
-              <w:pStyle w:val="Compact"/>
-              <w:jc w:val="left"/>
-            </w:pPr>
-            <w:r>
-              <w:t xml:space="preserve">15+ countries, sovereign cloud</w:t>
-            </w:r>
-          </w:p>
-        </w:tc>
-        <w:tc>
-          <w:tcPr/>
-          <w:p>
-            <w:pPr>
-              <w:pStyle w:val="Compact"/>
-              <w:jc w:val="left"/>
-            </w:pPr>
-            <w:r>
-              <w:t xml:space="preserve">₦40B+</w:t>
+              <w:t xml:space="preserve">23 Hardware SKUs</w:t>
+            </w:r>
+          </w:p>
+        </w:tc>
+        <w:tc>
+          <w:tcPr/>
+          <w:p>
+            <w:pPr>
+              <w:pStyle w:val="Compact"/>
+              <w:jc w:val="left"/>
+            </w:pPr>
+            <w:r>
+              <w:t xml:space="preserve">Widest African-optimized product range</w:t>
             </w:r>
           </w:p>
         </w:tc>
@@ -3516,8 +3351,87 @@
       </w:pPr>
     </w:lvl>
   </w:abstractNum>
+  <w:abstractNum w:abstractNumId="991">
+    <w:nsid w:val="A991"/>
+    <w:multiLevelType w:val="multilevel"/>
+    <w:lvl w:ilvl="0">
+      <w:numFmt w:val="bullet"/>
+      <w:lvlText w:val="•"/>
+      <w:lvlJc w:val="left"/>
+      <w:pPr>
+        <w:ind w:left="720" w:hanging="480"/>
+      </w:pPr>
+    </w:lvl>
+    <w:lvl w:ilvl="1">
+      <w:numFmt w:val="bullet"/>
+      <w:lvlText w:val="–"/>
+      <w:lvlJc w:val="left"/>
+      <w:pPr>
+        <w:ind w:left="1440" w:hanging="480"/>
+      </w:pPr>
+    </w:lvl>
+    <w:lvl w:ilvl="2">
+      <w:numFmt w:val="bullet"/>
+      <w:lvlText w:val="•"/>
+      <w:lvlJc w:val="left"/>
+      <w:pPr>
+        <w:ind w:left="2160" w:hanging="480"/>
+      </w:pPr>
+    </w:lvl>
+    <w:lvl w:ilvl="3">
+      <w:numFmt w:val="bullet"/>
+      <w:lvlText w:val="–"/>
+      <w:lvlJc w:val="left"/>
+      <w:pPr>
+        <w:ind w:left="2880" w:hanging="480"/>
+      </w:pPr>
+    </w:lvl>
+    <w:lvl w:ilvl="4">
+      <w:numFmt w:val="bullet"/>
+      <w:lvlText w:val="•"/>
+      <w:lvlJc w:val="left"/>
+      <w:pPr>
+        <w:ind w:left="3600" w:hanging="480"/>
+      </w:pPr>
+    </w:lvl>
+    <w:lvl w:ilvl="5">
+      <w:numFmt w:val="bullet"/>
+      <w:lvlText w:val="–"/>
+      <w:lvlJc w:val="left"/>
+      <w:pPr>
+        <w:ind w:left="4320" w:hanging="480"/>
+      </w:pPr>
+    </w:lvl>
+    <w:lvl w:ilvl="6">
+      <w:numFmt w:val="bullet"/>
+      <w:lvlText w:val="•"/>
+      <w:lvlJc w:val="left"/>
+      <w:pPr>
+        <w:ind w:left="5040" w:hanging="480"/>
+      </w:pPr>
+    </w:lvl>
+    <w:lvl w:ilvl="7">
+      <w:numFmt w:val="bullet"/>
+      <w:lvlText w:val="–"/>
+      <w:lvlJc w:val="left"/>
+      <w:pPr>
+        <w:ind w:left="5760" w:hanging="480"/>
+      </w:pPr>
+    </w:lvl>
+    <w:lvl w:ilvl="8">
+      <w:numFmt w:val="bullet"/>
+      <w:lvlText w:val="•"/>
+      <w:lvlJc w:val="left"/>
+      <w:pPr>
+        <w:ind w:left="6480" w:hanging="480"/>
+      </w:pPr>
+    </w:lvl>
+  </w:abstractNum>
   <w:num w:numId="1000">
     <w:abstractNumId w:val="990"/>
+  </w:num>
+  <w:num w:numId="1001">
+    <w:abstractNumId w:val="991"/>
   </w:num>
 </w:numbering>
 </file>

</xml_diff>